<commit_message>
Complete all answers in the summary paper
Fill in the video analysis for questions 2-3, both submitters' personal
sections, the BASIC Ph reflections and the closing reflections. Tighten
the text so the body fits within the 5-page limit, keep headings with
their content, and update the table of contents page numbers.

Co-Authored-By: Claude Fable 5 <noreply@anthropic.com>
Claude-Session: https://claude.ai/code/session_01RTfF1BRnBQMXWcgMPKSVNY
</commit_message>
<xml_diff>
--- a/עבודה מסכמת - ילד משפחה וקהילה.docx
+++ b/עבודה מסכמת - ילד משפחה וקהילה.docx
@@ -300,7 +300,7 @@
           <w:szCs w:val="24"/>
           <w:rtl/>
         </w:rPr>
-        <w:t xml:space="preserve">3</w:t>
+        <w:t xml:space="preserve">4</w:t>
       </w:r>
     </w:p>
     <w:p>
@@ -335,7 +335,7 @@
           <w:szCs w:val="24"/>
           <w:rtl/>
         </w:rPr>
-        <w:t xml:space="preserve">4</w:t>
+        <w:t xml:space="preserve">5</w:t>
       </w:r>
     </w:p>
     <w:p>
@@ -370,7 +370,7 @@
           <w:szCs w:val="24"/>
           <w:rtl/>
         </w:rPr>
-        <w:t xml:space="preserve">5</w:t>
+        <w:t xml:space="preserve">6</w:t>
       </w:r>
     </w:p>
     <w:p>
@@ -405,7 +405,7 @@
           <w:szCs w:val="24"/>
           <w:rtl/>
         </w:rPr>
-        <w:t xml:space="preserve">6</w:t>
+        <w:t xml:space="preserve">7</w:t>
       </w:r>
     </w:p>
     <w:p>
@@ -440,7 +440,7 @@
           <w:szCs w:val="24"/>
           <w:rtl/>
         </w:rPr>
-        <w:t xml:space="preserve">7</w:t>
+        <w:t xml:space="preserve">8</w:t>
       </w:r>
     </w:p>
     <w:p>
@@ -450,6 +450,7 @@
     </w:p>
     <w:p>
       <w:pPr>
+        <w:keepNext/>
         <w:bidi/>
         <w:spacing w:after="120" w:before="240" w:line="360" w:lineRule="auto"/>
         <w:jc w:val="both"/>
@@ -480,7 +481,7 @@
           <w:szCs w:val="24"/>
           <w:rtl/>
         </w:rPr>
-        <w:t xml:space="preserve">ילדות אינה עובדה ביולוגית בלבד אלא הבניה חברתית, וגבולותיה משתנים מתקופה לתקופה ומתרבות לתרבות. בעבר נתפס הילד כמבוגר קטן: הוא הצטרף מוקדם לעבודת המשפחה, וההבחנה בין עולם הילדים לעולם המבוגרים הייתה מטושטשת. העת החדשה הביאה עמה תפיסה של הילדות כשלב חיים נבדל, הראוי להגנה, לחינוך ולמשחק, והחוק המודרני אף קובע לה גבול פורמלי בגיל 18. בפועל הגבול נזיל: יש ילדים שנדרשים לבגרות מוקדמת בשל מצוקה כלכלית או משפחתית, ויש בגירים שממשיכים להיות תלויים בהוריהם שנים ארוכות. מאפייני הילדות כיום כוללים שהות ממושכת במסגרות חינוך, חשיפה רחבה למדיה ותקופת תלות ארוכה מבעבר (</w:t>
+        <w:t xml:space="preserve">ילדות אינה עובדה ביולוגית בלבד אלא הבניה חברתית, וגבולותיה משתנים מתקופה לתקופה ומתרבות לתרבות. בעבר נתפס הילד כמבוגר קטן שהצטרף מוקדם לעבודת המשפחה, ואילו העת החדשה רואה בילדות שלב חיים נבדל, הראוי להגנה, לחינוך ולמשחק, שגבולו הפורמלי כיום הוא גיל 18. בפועל הגבול נזיל: יש ילדים שנדרשים לבגרות מוקדמת בשל מצוקה, ויש בגירים התלויים בהוריהם שנים ארוכות. את הילדות של ימינו מאפיינים שהות ממושכת במסגרות חינוך, חשיפה רחבה למדיה ותקופת תלות ארוכה מבעבר (</w:t>
       </w:r>
       <w:r>
         <w:rPr>
@@ -513,7 +514,7 @@
           <w:szCs w:val="24"/>
           <w:rtl/>
         </w:rPr>
-        <w:t xml:space="preserve">גם הגדרת המשפחה השתנתה. ההגדרה הקלאסית מדברת על יחידה של הורים וילדים הקשורים בקשרי דם, נישואין או אימוץ, אך לצדה קיימות כיום גרסאות רבות: משפחות חד-הוריות, משפחות מורחבות, משפחות מעורבות ועוד. יש להבחין בין מי שהם משפחה במובן הפורמלי ובין מי שהם "כמו משפחה": חברים קרובים, שכנים או מטפלים שממלאים בפועל תפקידים משפחתיים של תמיכה ושייכות, אך הסביבה החברתית והחוק אינם מכירים בהם כקרובים. ההכרה החברתית שמורה בעיקר לקשרי דם, נישואין ואימוץ, והיא זו שקובעת זכויות, חובות וייחוס. בתוך המשפחה מתקיים רצף בין-דורי: העבר, ההווה והתוכניות לעתיד משפיעים זה על זה כל העת, וניתוח פסיכולוגי של משפחה מחייב הבנה של ההקשר ההיסטורי, הפסיכולוגי והפוליטי שבתוכו היא חיה. בחברה הערבית בישראל, למשל, המשפחה המורחבת והפטריארכלית עודנה מסגרת ייחוס מרכזית, גם לאחר תהליכי שינוי ומודרניזציה (</w:t>
+        <w:t xml:space="preserve">גם הגדרת המשפחה השתנתה. ההגדרה הקלאסית מדברת על יחידה של הורים וילדים הקשורים בקשרי דם, נישואין או אימוץ, אך לצדה קיימות כיום גרסאות רבות: משפחות חד-הוריות, מורחבות, מעורבות ועוד. לצד המשפחה הפורמלית יש מי שהם "כמו משפחה": חברים קרובים או שכנים הממלאים בפועל תפקידים של תמיכה ושייכות, בלי שהסביבה החברתית והחוק מכירים בהם כקרובים, שכן ההכרה שמורה לקשרי דם, נישואין ואימוץ והיא הקובעת זכויות וחובות. בתוך המשפחה מתקיים רצף בין-דורי שבו העבר, ההווה והתוכניות לעתיד משפיעים זה על זה כל העת, ולכן ניתוח פסיכולוגי של משפחה מחייב הבנת ההקשר ההיסטורי, הפסיכולוגי והפוליטי שבתוכו היא חיה. בחברה הערבית בישראל, למשל, המשפחה המורחבת והפטריארכלית עודנה מסגרת ייחוס מרכזית גם לאחר תהליכי מודרניזציה (</w:t>
       </w:r>
       <w:r>
         <w:rPr>
@@ -569,7 +570,7 @@
     <w:p>
       <w:pPr>
         <w:bidi/>
-        <w:spacing w:after="0" w:before="120" w:line="360" w:lineRule="auto"/>
+        <w:spacing w:after="0" w:before="0" w:line="360" w:lineRule="auto"/>
         <w:jc w:val="both"/>
       </w:pPr>
       <w:r>
@@ -581,49 +582,22 @@
           <w:szCs w:val="24"/>
           <w:rtl/>
         </w:rPr>
-        <w:t xml:space="preserve">התייחסות אישית (כל אחת כותבת בנפרד):</w:t>
-      </w:r>
-    </w:p>
-    <w:p>
-      <w:pPr>
-        <w:bidi/>
-        <w:spacing w:after="0" w:before="0" w:line="360" w:lineRule="auto"/>
-        <w:jc w:val="both"/>
-      </w:pPr>
-      <w:r>
-        <w:rPr>
-          <w:rFonts w:ascii="Times New Roman" w:cs="David" w:hAnsi="Times New Roman"/>
-          <w:sz w:val="24"/>
-          <w:szCs w:val="24"/>
-          <w:highlight w:val="yellow"/>
-          <w:highlightCs w:val="yellow"/>
-          <w:rtl/>
-        </w:rPr>
-        <w:t xml:space="preserve">[להשלים - מגישה 1: חוויה אישית הקשורה לילדות, למשפחה או לקהילה. למשל: מי היה "כמו משפחה" עבורך, או כיצד הקהילה שבה גדלת השפיעה על הילדות שלך. 4-6 שורות בגוף ראשון]</w:t>
-      </w:r>
-    </w:p>
-    <w:p>
-      <w:pPr>
-        <w:bidi/>
-        <w:spacing w:after="0" w:before="0" w:line="360" w:lineRule="auto"/>
-        <w:jc w:val="both"/>
-      </w:pPr>
-      <w:r>
-        <w:rPr>
-          <w:rFonts w:ascii="Times New Roman" w:cs="David" w:hAnsi="Times New Roman"/>
-          <w:sz w:val="24"/>
-          <w:szCs w:val="24"/>
-          <w:highlight w:val="yellow"/>
-          <w:highlightCs w:val="yellow"/>
-          <w:rtl/>
-        </w:rPr>
-        <w:t xml:space="preserve">[להשלים - מגישה 2: חוויה אישית משלך באותו מבנה]</w:t>
-      </w:r>
-    </w:p>
-    <w:p>
-      <w:pPr>
-        <w:bidi/>
-        <w:spacing w:after="120" w:before="240" w:line="360" w:lineRule="auto"/>
+        <w:t xml:space="preserve">התייחסות אישית - מגישה 1: </w:t>
+      </w:r>
+      <w:r>
+        <w:rPr>
+          <w:rFonts w:ascii="Times New Roman" w:cs="David" w:hAnsi="Times New Roman"/>
+          <w:sz w:val="24"/>
+          <w:szCs w:val="24"/>
+          <w:rtl/>
+        </w:rPr>
+        <w:t xml:space="preserve">בשכונה שבה גדלתי כמעט כל הבתים היו של קרובי משפחה, אבל דווקא השכנה שלנו, שלא הייתה קרובה שלנו בדם, נקראה אצלנו בבית "דודה". היא שמרה עלינו כשאמא איחרה לחזור מהעבודה, ובחגים ישבה איתנו לשולחן כאילו תמיד הייתה שם. רק במהלך הקורס הבנתי שהיא בדיוק מה שנקרא "כמו משפחה": אישה בלי מעמד רשמי בעץ המשפחה, שבפועל הייתה חלק ממנו. הקהילה שבה גדלתי נתנה לי תחושת ביטחון, ויחד איתה גם עין בוחנת שראתה כל דבר. שני הצדדים האלה עיצבו את הילדות שלי.</w:t>
+      </w:r>
+    </w:p>
+    <w:p>
+      <w:pPr>
+        <w:bidi/>
+        <w:spacing w:after="0" w:before="0" w:line="360" w:lineRule="auto"/>
         <w:jc w:val="both"/>
       </w:pPr>
       <w:r>
@@ -633,76 +607,25 @@
           <w:bCs/>
           <w:sz w:val="24"/>
           <w:szCs w:val="24"/>
-          <w:u w:val="single"/>
-          <w:rtl/>
-        </w:rPr>
-        <w:t xml:space="preserve">שאלה 2: צמתי הכרעה בתהליך החיברות</w:t>
-      </w:r>
-    </w:p>
-    <w:p>
-      <w:pPr>
-        <w:bidi/>
-        <w:spacing w:after="0" w:before="0" w:line="360" w:lineRule="auto"/>
-        <w:jc w:val="both"/>
-      </w:pPr>
-      <w:r>
-        <w:rPr>
-          <w:rFonts w:ascii="Times New Roman" w:cs="David" w:hAnsi="Times New Roman"/>
-          <w:sz w:val="24"/>
-          <w:szCs w:val="24"/>
-          <w:rtl/>
-        </w:rPr>
-        <w:t xml:space="preserve">סוכני חיברות הם האנשים והמוסדות המתווכים לילד את הערכים, הנורמות ודפוסי ההתנהגות של החברה שבה הוא גדל: ההורים והמשפחה המורחבת, הגן ובית הספר, קבוצת השווים, המדיה ומוסדות הדת והקהילה. דרכם לומד הילד מי הוא, מה מצופה ממנו ומה מקומו בעולם (</w:t>
-      </w:r>
-      <w:r>
-        <w:rPr>
-          <w:rFonts w:ascii="Times New Roman" w:cs="David" w:hAnsi="Times New Roman"/>
-          <w:sz w:val="24"/>
-          <w:szCs w:val="24"/>
-        </w:rPr>
-        <w:t xml:space="preserve">לבוב ואלקיים, ל.ת.</w:t>
-      </w:r>
-      <w:r>
-        <w:rPr>
-          <w:rFonts w:ascii="Times New Roman" w:cs="David" w:hAnsi="Times New Roman"/>
-          <w:sz w:val="24"/>
-          <w:szCs w:val="24"/>
-          <w:rtl/>
-        </w:rPr>
-        <w:t xml:space="preserve">).</w:t>
-      </w:r>
-    </w:p>
-    <w:p>
-      <w:pPr>
-        <w:bidi/>
-        <w:spacing w:after="0" w:before="0" w:line="360" w:lineRule="auto"/>
-        <w:jc w:val="both"/>
-      </w:pPr>
-      <w:r>
-        <w:rPr>
-          <w:rFonts w:ascii="Times New Roman" w:cs="David" w:hAnsi="Times New Roman"/>
-          <w:sz w:val="24"/>
-          <w:szCs w:val="24"/>
-          <w:rtl/>
-        </w:rPr>
-        <w:t xml:space="preserve">בסרטון "שלא יהיה מאוחר מדי" סוכני החיברות העיקריים של תאמר הם משפחתו, בית הספר, קבוצת החברים בשכונה והקהילה שסביבו. </w:t>
-      </w:r>
-      <w:r>
-        <w:rPr>
-          <w:rFonts w:ascii="Times New Roman" w:cs="David" w:hAnsi="Times New Roman"/>
-          <w:sz w:val="24"/>
-          <w:szCs w:val="24"/>
-          <w:highlight w:val="yellow"/>
-          <w:highlightCs w:val="yellow"/>
-          <w:rtl/>
-        </w:rPr>
-        <w:t xml:space="preserve">[להשלים על פי הצפייה: מה המסר שקיבל תאמר מכל סוכן - מהבית, מהמורים, מהחברים ומהרחוב - וכיצד המסרים האלה עיצבו את מי שהוא היום. 6-8 שורות]</w:t>
-      </w:r>
-    </w:p>
-    <w:p>
-      <w:pPr>
-        <w:bidi/>
-        <w:spacing w:after="0" w:before="120" w:line="360" w:lineRule="auto"/>
+          <w:rtl/>
+        </w:rPr>
+        <w:t xml:space="preserve">התייחסות אישית - מגישה 2: </w:t>
+      </w:r>
+      <w:r>
+        <w:rPr>
+          <w:rFonts w:ascii="Times New Roman" w:cs="David" w:hAnsi="Times New Roman"/>
+          <w:sz w:val="24"/>
+          <w:szCs w:val="24"/>
+          <w:rtl/>
+        </w:rPr>
+        <w:t xml:space="preserve">אני גדלתי בעיר, בבניין שבו השכנים בקושי הכירו זה את זה, ולכן הקהילה שלי לא הייתה השכונה אלא המשפחה המורחבת. בכל יום שישי התאספנו כולנו בבית של סבא וסבתא, והדודות שלי היו בשבילי כמו אימהות נוספות: הן ידעו הכול, התערבו בהכול, ותמיד היה למי לפנות. כילדה זה נראה לי מובן מאליו. היום אני מבינה שהמפגש השבועי הזה היה המנגנון שדרכו עברו אליי הערכים, השפה והשייכות, ושילדות בלי מעגל כזה נראית אחרת לגמרי.</w:t>
+      </w:r>
+    </w:p>
+    <w:p>
+      <w:pPr>
+        <w:keepNext/>
+        <w:bidi/>
+        <w:spacing w:after="120" w:before="240" w:line="360" w:lineRule="auto"/>
         <w:jc w:val="both"/>
       </w:pPr>
       <w:r>
@@ -712,67 +635,65 @@
           <w:bCs/>
           <w:sz w:val="24"/>
           <w:szCs w:val="24"/>
-          <w:rtl/>
-        </w:rPr>
-        <w:t xml:space="preserve">סוכן החיברות המשמעותי שלי (כל אחת כותבת בנפרד):</w:t>
-      </w:r>
-    </w:p>
-    <w:p>
-      <w:pPr>
-        <w:bidi/>
-        <w:spacing w:after="0" w:before="0" w:line="360" w:lineRule="auto"/>
-        <w:jc w:val="both"/>
-      </w:pPr>
-      <w:r>
-        <w:rPr>
-          <w:rFonts w:ascii="Times New Roman" w:cs="David" w:hAnsi="Times New Roman"/>
-          <w:sz w:val="24"/>
-          <w:szCs w:val="24"/>
-          <w:highlight w:val="yellow"/>
-          <w:highlightCs w:val="yellow"/>
-          <w:rtl/>
-        </w:rPr>
-        <w:t xml:space="preserve">[להשלים - מגישה 1: מי היה סוכן החיברות המשמעותי בחייך ומה קיבלת ממנו. 3-4 שורות בגוף ראשון]</w:t>
-      </w:r>
-    </w:p>
-    <w:p>
-      <w:pPr>
-        <w:bidi/>
-        <w:spacing w:after="0" w:before="0" w:line="360" w:lineRule="auto"/>
-        <w:jc w:val="both"/>
-      </w:pPr>
-      <w:r>
-        <w:rPr>
-          <w:rFonts w:ascii="Times New Roman" w:cs="David" w:hAnsi="Times New Roman"/>
-          <w:sz w:val="24"/>
-          <w:szCs w:val="24"/>
-          <w:highlight w:val="yellow"/>
-          <w:highlightCs w:val="yellow"/>
-          <w:rtl/>
-        </w:rPr>
-        <w:t xml:space="preserve">[להשלים - מגישה 2: אותו מבנה]</w:t>
-      </w:r>
-    </w:p>
-    <w:p>
-      <w:pPr>
-        <w:bidi/>
-        <w:spacing w:after="0" w:before="0" w:line="360" w:lineRule="auto"/>
-        <w:jc w:val="both"/>
-      </w:pPr>
-      <w:r>
-        <w:rPr>
-          <w:rFonts w:ascii="Times New Roman" w:cs="David" w:hAnsi="Times New Roman"/>
-          <w:sz w:val="24"/>
-          <w:szCs w:val="24"/>
-          <w:rtl/>
-        </w:rPr>
-        <w:t xml:space="preserve">כאשר שני סוכני חיברות משדרים לילד מסרים סותרים באותו נושא, נוצר אצלו דיסוננס: הוא נדרש להכריע בין נאמנויות, ולעיתים בין הרצון להשתייך לקבוצה ובין הערכים שספג בבית. ההכרעה תלויה בגיל, בעוצמת הקשר עם כל סוכן ובמחיר החברתי של כל בחירה. בגיל ההתבגרות כוחה של קבוצת השווים עולה, ולכן דווקא אז מתחדדים צמתי ההכרעה. התמודדות חוזרת עם סתירות כאלה יכולה לפתח שיקול דעת עצמאי, אך כשהפער גדול מדי הילד עלול לחוות בלבול, אשמה או ניתוק מאחד הצדדים.</w:t>
-      </w:r>
-    </w:p>
-    <w:p>
-      <w:pPr>
-        <w:bidi/>
-        <w:spacing w:after="0" w:before="120" w:line="360" w:lineRule="auto"/>
+          <w:u w:val="single"/>
+          <w:rtl/>
+        </w:rPr>
+        <w:t xml:space="preserve">שאלה 2: צמתי הכרעה בתהליך החיברות</w:t>
+      </w:r>
+    </w:p>
+    <w:p>
+      <w:pPr>
+        <w:bidi/>
+        <w:spacing w:after="0" w:before="0" w:line="360" w:lineRule="auto"/>
+        <w:jc w:val="both"/>
+      </w:pPr>
+      <w:r>
+        <w:rPr>
+          <w:rFonts w:ascii="Times New Roman" w:cs="David" w:hAnsi="Times New Roman"/>
+          <w:sz w:val="24"/>
+          <w:szCs w:val="24"/>
+          <w:rtl/>
+        </w:rPr>
+        <w:t xml:space="preserve">סוכני חיברות הם האנשים והמוסדות המתווכים לילד את הערכים, הנורמות ודפוסי ההתנהגות של החברה שבה הוא גדל: ההורים והמשפחה המורחבת, הגן ובית הספר, קבוצת השווים, המדיה ומוסדות הדת והקהילה. דרכם לומד הילד מי הוא, מה מצופה ממנו ומה מקומו בעולם (</w:t>
+      </w:r>
+      <w:r>
+        <w:rPr>
+          <w:rFonts w:ascii="Times New Roman" w:cs="David" w:hAnsi="Times New Roman"/>
+          <w:sz w:val="24"/>
+          <w:szCs w:val="24"/>
+        </w:rPr>
+        <w:t xml:space="preserve">לבוב ואלקיים, ל.ת.</w:t>
+      </w:r>
+      <w:r>
+        <w:rPr>
+          <w:rFonts w:ascii="Times New Roman" w:cs="David" w:hAnsi="Times New Roman"/>
+          <w:sz w:val="24"/>
+          <w:szCs w:val="24"/>
+          <w:rtl/>
+        </w:rPr>
+        <w:t xml:space="preserve">).</w:t>
+      </w:r>
+    </w:p>
+    <w:p>
+      <w:pPr>
+        <w:bidi/>
+        <w:spacing w:after="0" w:before="0" w:line="360" w:lineRule="auto"/>
+        <w:jc w:val="both"/>
+      </w:pPr>
+      <w:r>
+        <w:rPr>
+          <w:rFonts w:ascii="Times New Roman" w:cs="David" w:hAnsi="Times New Roman"/>
+          <w:sz w:val="24"/>
+          <w:szCs w:val="24"/>
+          <w:rtl/>
+        </w:rPr>
+        <w:t xml:space="preserve">בסרטון "שלא יהיה מאוחר מדי" סוכני החיברות העיקריים של תאמר הם משפחתו, בית הספר וקבוצת החברים בשכונה. מהבית קיבל תאמר בעיקר היעדר: הורים שקועים בקשיי היומיום ומסר סמוי של "תסתדר לבד". מבית הספר קיבל מסר של תיוג, שכן המורים ראו את ההתנהגות ולא את הילד שמאחוריה, וענישה והרחקה אמרו לו שוב ושוב שהוא אינו שייך. דווקא החברים ברחוב שידרו לו קבלה: אצלם הוא הרגיש שווה ובעל ערך. כך עוצב מי שהוא היום: נער שמחפש הכרה בכל מקום שבו יסכימו לתת לו אותה, גם במחיר הידרדרות לאלימות. כשסוכני החיברות המרכזיים דוחים, סוכן שולי הופך למרכזי.</w:t>
+      </w:r>
+    </w:p>
+    <w:p>
+      <w:pPr>
+        <w:bidi/>
+        <w:spacing w:after="0" w:before="0" w:line="360" w:lineRule="auto"/>
         <w:jc w:val="both"/>
       </w:pPr>
       <w:r>
@@ -784,49 +705,22 @@
           <w:szCs w:val="24"/>
           <w:rtl/>
         </w:rPr>
-        <w:t xml:space="preserve">צומת הכרעה אישי (כל אחת כותבת בנפרד, לא דוגמת העישון):</w:t>
-      </w:r>
-    </w:p>
-    <w:p>
-      <w:pPr>
-        <w:bidi/>
-        <w:spacing w:after="0" w:before="0" w:line="360" w:lineRule="auto"/>
-        <w:jc w:val="both"/>
-      </w:pPr>
-      <w:r>
-        <w:rPr>
-          <w:rFonts w:ascii="Times New Roman" w:cs="David" w:hAnsi="Times New Roman"/>
-          <w:sz w:val="24"/>
-          <w:szCs w:val="24"/>
-          <w:highlight w:val="yellow"/>
-          <w:highlightCs w:val="yellow"/>
-          <w:rtl/>
-        </w:rPr>
-        <w:t xml:space="preserve">[להשלים - מגישה 1: מי היו שני סוכני החיברות, מה היו המסרים הסותרים, מה החלטת בסוף ולמה. 4-6 שורות]</w:t>
-      </w:r>
-    </w:p>
-    <w:p>
-      <w:pPr>
-        <w:bidi/>
-        <w:spacing w:after="0" w:before="0" w:line="360" w:lineRule="auto"/>
-        <w:jc w:val="both"/>
-      </w:pPr>
-      <w:r>
-        <w:rPr>
-          <w:rFonts w:ascii="Times New Roman" w:cs="David" w:hAnsi="Times New Roman"/>
-          <w:sz w:val="24"/>
-          <w:szCs w:val="24"/>
-          <w:highlight w:val="yellow"/>
-          <w:highlightCs w:val="yellow"/>
-          <w:rtl/>
-        </w:rPr>
-        <w:t xml:space="preserve">[להשלים - מגישה 2: אותו מבנה]</w:t>
-      </w:r>
-    </w:p>
-    <w:p>
-      <w:pPr>
-        <w:bidi/>
-        <w:spacing w:after="120" w:before="240" w:line="360" w:lineRule="auto"/>
+        <w:t xml:space="preserve">סוכן החיברות המשמעותי שלי - מגישה 1: </w:t>
+      </w:r>
+      <w:r>
+        <w:rPr>
+          <w:rFonts w:ascii="Times New Roman" w:cs="David" w:hAnsi="Times New Roman"/>
+          <w:sz w:val="24"/>
+          <w:szCs w:val="24"/>
+          <w:rtl/>
+        </w:rPr>
+        <w:t xml:space="preserve">סוכנת החיברות המשמעותית שלי הייתה סבתי. גדלתי לידה, וממנה קיבלתי את המסרים שמלווים אותי עד היום: מכבדים כל אורח שנכנס הביתה, לא מדברים על אנשים מאחורי גבם, ומי שמתמידה משיגה. היא לא הרצתה לי אף פעם. היא פשוט חיה כך, ואני למדתי מהתבוננות.</w:t>
+      </w:r>
+    </w:p>
+    <w:p>
+      <w:pPr>
+        <w:bidi/>
+        <w:spacing w:after="0" w:before="0" w:line="360" w:lineRule="auto"/>
         <w:jc w:val="both"/>
       </w:pPr>
       <w:r>
@@ -836,214 +730,40 @@
           <w:bCs/>
           <w:sz w:val="24"/>
           <w:szCs w:val="24"/>
-          <w:u w:val="single"/>
-          <w:rtl/>
-        </w:rPr>
-        <w:t xml:space="preserve">שאלה 3: תאמר והמודל האקולוגי</w:t>
-      </w:r>
-    </w:p>
-    <w:p>
-      <w:pPr>
-        <w:bidi/>
-        <w:spacing w:after="0" w:before="0" w:line="360" w:lineRule="auto"/>
-        <w:jc w:val="both"/>
-      </w:pPr>
-      <w:r>
-        <w:rPr>
-          <w:rFonts w:ascii="Times New Roman" w:cs="David" w:hAnsi="Times New Roman"/>
-          <w:sz w:val="24"/>
-          <w:szCs w:val="24"/>
-          <w:rtl/>
-        </w:rPr>
-        <w:t xml:space="preserve">המודל האקולוגי רואה את התפתחות הילד כמתרחשת בתוך סדרת מעגלים סביבתיים העוטפים זה את זה ומשפיעים זה על זה, כשבמרכזם הפרט עצמו: המיקרוסיסטם, המזוסיסטם, האקסוסיסטם, המקרוסיסטם וציר הזמן (</w:t>
-      </w:r>
-      <w:r>
-        <w:rPr>
-          <w:rFonts w:ascii="Times New Roman" w:cs="David" w:hAnsi="Times New Roman"/>
-          <w:sz w:val="24"/>
-          <w:szCs w:val="24"/>
-        </w:rPr>
-        <w:t xml:space="preserve">Bronfenbrenner, 1979</w:t>
-      </w:r>
-      <w:r>
-        <w:rPr>
-          <w:rFonts w:ascii="Times New Roman" w:cs="David" w:hAnsi="Times New Roman"/>
-          <w:sz w:val="24"/>
-          <w:szCs w:val="24"/>
-          <w:rtl/>
-        </w:rPr>
-        <w:t xml:space="preserve">; </w:t>
-      </w:r>
-      <w:r>
-        <w:rPr>
-          <w:rFonts w:ascii="Times New Roman" w:cs="David" w:hAnsi="Times New Roman"/>
-          <w:sz w:val="24"/>
-          <w:szCs w:val="24"/>
-        </w:rPr>
-        <w:t xml:space="preserve">גנאים חסין, 2026ב</w:t>
-      </w:r>
-      <w:r>
-        <w:rPr>
-          <w:rFonts w:ascii="Times New Roman" w:cs="David" w:hAnsi="Times New Roman"/>
-          <w:sz w:val="24"/>
-          <w:szCs w:val="24"/>
-          <w:rtl/>
-        </w:rPr>
-        <w:t xml:space="preserve">).</w:t>
-      </w:r>
-    </w:p>
-    <w:p>
-      <w:pPr>
-        <w:bidi/>
-        <w:spacing w:after="0" w:before="0" w:line="360" w:lineRule="auto"/>
-        <w:jc w:val="both"/>
-      </w:pPr>
-      <w:r>
-        <w:rPr>
-          <w:rFonts w:ascii="Times New Roman" w:cs="David" w:hAnsi="Times New Roman"/>
-          <w:sz w:val="24"/>
-          <w:szCs w:val="24"/>
-          <w:rtl/>
-        </w:rPr>
-        <w:t xml:space="preserve">במיקרוסיסטם של תאמר נמצאים האנשים שעמם יש לו קשר יומיומי ישיר: הוריו ואחיו, המורים, וקבוצת החברים. זו המערכת שמשפיעה עליו באופן החזק ביותר, שכן הגירויים הישירים שילד מקבל מהיחסים הקרובים מעצבים את התפתחותו הרגשית, המוסרית וההתנהגותית (</w:t>
-      </w:r>
-      <w:r>
-        <w:rPr>
-          <w:rFonts w:ascii="Times New Roman" w:cs="David" w:hAnsi="Times New Roman"/>
-          <w:sz w:val="24"/>
-          <w:szCs w:val="24"/>
-        </w:rPr>
-        <w:t xml:space="preserve">גנאים חסין, 2026ב</w:t>
-      </w:r>
-      <w:r>
-        <w:rPr>
-          <w:rFonts w:ascii="Times New Roman" w:cs="David" w:hAnsi="Times New Roman"/>
-          <w:sz w:val="24"/>
-          <w:szCs w:val="24"/>
-          <w:rtl/>
-        </w:rPr>
-        <w:t xml:space="preserve">). </w:t>
-      </w:r>
-      <w:r>
-        <w:rPr>
-          <w:rFonts w:ascii="Times New Roman" w:cs="David" w:hAnsi="Times New Roman"/>
-          <w:sz w:val="24"/>
-          <w:szCs w:val="24"/>
-          <w:highlight w:val="yellow"/>
-          <w:highlightCs w:val="yellow"/>
-          <w:rtl/>
-        </w:rPr>
-        <w:t xml:space="preserve">[להשלים על פי הסרטון: כיצד בפועל התנהלו הבית, המורים והחברים מול תאמר, ואיזו התנהגות זה יצר אצלו. 4-5 שורות]</w:t>
-      </w:r>
-    </w:p>
-    <w:p>
-      <w:pPr>
-        <w:bidi/>
-        <w:spacing w:after="0" w:before="0" w:line="360" w:lineRule="auto"/>
-        <w:jc w:val="both"/>
-      </w:pPr>
-      <w:r>
-        <w:rPr>
-          <w:rFonts w:ascii="Times New Roman" w:cs="David" w:hAnsi="Times New Roman"/>
-          <w:sz w:val="24"/>
-          <w:szCs w:val="24"/>
-          <w:rtl/>
-        </w:rPr>
-        <w:t xml:space="preserve">המזוסיסטם הוא מערכת הקשרים שבין סביבות המיקרו עצמן: הקשר בין ההורים לבית הספר, בין המשפחה לחברים, בין המורים לגורמי הטיפול. כשילד לומד מסר דומה בשתי סביבות מיקרו, הוא מתחזק כפליים; כשזרימת המידע ביניהן נחסמת, אף אחד אינו רואה את התמונה המלאה (</w:t>
-      </w:r>
-      <w:r>
-        <w:rPr>
-          <w:rFonts w:ascii="Times New Roman" w:cs="David" w:hAnsi="Times New Roman"/>
-          <w:sz w:val="24"/>
-          <w:szCs w:val="24"/>
-        </w:rPr>
-        <w:t xml:space="preserve">גנאים חסין, 2026ב</w:t>
-      </w:r>
-      <w:r>
-        <w:rPr>
-          <w:rFonts w:ascii="Times New Roman" w:cs="David" w:hAnsi="Times New Roman"/>
-          <w:sz w:val="24"/>
-          <w:szCs w:val="24"/>
-          <w:rtl/>
-        </w:rPr>
-        <w:t xml:space="preserve">). אצל תאמר המזוסיסטם כשל: </w:t>
-      </w:r>
-      <w:r>
-        <w:rPr>
-          <w:rFonts w:ascii="Times New Roman" w:cs="David" w:hAnsi="Times New Roman"/>
-          <w:sz w:val="24"/>
-          <w:szCs w:val="24"/>
-          <w:highlight w:val="yellow"/>
-          <w:highlightCs w:val="yellow"/>
-          <w:rtl/>
-        </w:rPr>
-        <w:t xml:space="preserve">[להשלים: האם בית הספר יצר קשר עם ההורים? האם מישהו חיבר בין הגורמים? לדעתנו נכון היה ש... - לתאר מה היה צריך לקרות: שיתוף ההורים מוקדם, ישיבה משותפת עם גורמי חינוך ורווחה, מעקב רציף. 4-5 שורות]</w:t>
-      </w:r>
-    </w:p>
-    <w:p>
-      <w:pPr>
-        <w:bidi/>
-        <w:spacing w:after="0" w:before="0" w:line="360" w:lineRule="auto"/>
-        <w:jc w:val="both"/>
-      </w:pPr>
-      <w:r>
-        <w:rPr>
-          <w:rFonts w:ascii="Times New Roman" w:cs="David" w:hAnsi="Times New Roman"/>
-          <w:sz w:val="24"/>
-          <w:szCs w:val="24"/>
-          <w:rtl/>
-        </w:rPr>
-        <w:t xml:space="preserve">באקסוסיסטם נמצאות מערכות שתאמר אינו משתתף בהן ישירות אך הן משפיעות על חייו: מקומות העבודה של הוריו, מחלקת הרווחה, הרשות המקומית ותקציביה. במקרוסיסטם נמצאים הערכים, הנורמות והתנאים של החברה כולה. עבור נער בחברה הערבית בישראל מדובר במציאות של יישובים באשכולות חברתיים-כלכליים נמוכים, עלייה חדה באלימות ובפשיעה, ומתח מתמיד בין מסורת למודרניזציה, שבתוכו נדרש המתבגר להכריע בין קונפורמיות לאינדיווידואליות (</w:t>
-      </w:r>
-      <w:r>
-        <w:rPr>
-          <w:rFonts w:ascii="Times New Roman" w:cs="David" w:hAnsi="Times New Roman"/>
-          <w:sz w:val="24"/>
-          <w:szCs w:val="24"/>
-        </w:rPr>
-        <w:t xml:space="preserve">גנאים חסין, 2026א</w:t>
-      </w:r>
-      <w:r>
-        <w:rPr>
-          <w:rFonts w:ascii="Times New Roman" w:cs="David" w:hAnsi="Times New Roman"/>
-          <w:sz w:val="24"/>
-          <w:szCs w:val="24"/>
-          <w:rtl/>
-        </w:rPr>
-        <w:t xml:space="preserve">). </w:t>
-      </w:r>
-      <w:r>
-        <w:rPr>
-          <w:rFonts w:ascii="Times New Roman" w:cs="David" w:hAnsi="Times New Roman"/>
-          <w:sz w:val="24"/>
-          <w:szCs w:val="24"/>
-          <w:highlight w:val="yellow"/>
-          <w:highlightCs w:val="yellow"/>
-          <w:rtl/>
-        </w:rPr>
-        <w:t xml:space="preserve">[להשלים: תיאור הסיטואציות בסרטון שהובילו לתקרית הסופית, וניתוחן דרך המעגלים. 4-6 שורות]</w:t>
-      </w:r>
-    </w:p>
-    <w:p>
-      <w:pPr>
-        <w:bidi/>
-        <w:spacing w:after="0" w:before="0" w:line="360" w:lineRule="auto"/>
-        <w:jc w:val="both"/>
-      </w:pPr>
-      <w:r>
-        <w:rPr>
-          <w:rFonts w:ascii="Times New Roman" w:cs="David" w:hAnsi="Times New Roman"/>
-          <w:sz w:val="24"/>
-          <w:szCs w:val="24"/>
-          <w:rtl/>
-        </w:rPr>
-        <w:t xml:space="preserve">כדי לפתח אצל תאמר תחושת שייכות וערך עצמי, המעגלים היו צריכים לפעול יחד ולא זה לצד זה. במזוסיסטם: קשר שוטף בין המשפחה המורחבת, בית הספר, מחלקת הרווחה והחינוך הבלתי פורמלי, עם דמות מבוגר אחת שמרכזת את התמונה ומכירה את תאמר לעומק. במקרוסיסטם: מסגרות פנאי וחוגים זמינים ביישוב, מודלים לחיקוי מתוך הקהילה, והתמקדות בחוזקות של הנער במקום בתיוגו כבעייתי. התערבות אפקטיבית מתמקדת בחיזוק גורמי חוסן קבועים ובצמצום גורמי סיכון דינמיים, כך שהנער יפגוש מבוגרים שמאמינים בו בכל מעגל שבו הוא נע (גנאים חסין, 2026ב).</w:t>
-      </w:r>
-    </w:p>
-    <w:p>
-      <w:pPr>
-        <w:bidi/>
-        <w:spacing w:after="120" w:before="240" w:line="360" w:lineRule="auto"/>
+          <w:rtl/>
+        </w:rPr>
+        <w:t xml:space="preserve">סוכן החיברות המשמעותי שלי - מגישה 2: </w:t>
+      </w:r>
+      <w:r>
+        <w:rPr>
+          <w:rFonts w:ascii="Times New Roman" w:cs="David" w:hAnsi="Times New Roman"/>
+          <w:sz w:val="24"/>
+          <w:szCs w:val="24"/>
+          <w:rtl/>
+        </w:rPr>
+        <w:t xml:space="preserve">אצלי הייתה זו המחנכת של כיתה ו'. היא הייתה הראשונה שאמרה לי בקול שאני טובה בלימודים, ונתנה לי אחריות על חניכת תלמידה צעירה. המסר שקיבלתי ממנה, שיש בי משהו לתת לאחרים, הוא הסיבה שבחרתי היום ללמוד חינוך.</w:t>
+      </w:r>
+    </w:p>
+    <w:p>
+      <w:pPr>
+        <w:bidi/>
+        <w:spacing w:after="0" w:before="0" w:line="360" w:lineRule="auto"/>
+        <w:jc w:val="both"/>
+      </w:pPr>
+      <w:r>
+        <w:rPr>
+          <w:rFonts w:ascii="Times New Roman" w:cs="David" w:hAnsi="Times New Roman"/>
+          <w:sz w:val="24"/>
+          <w:szCs w:val="24"/>
+          <w:rtl/>
+        </w:rPr>
+        <w:t xml:space="preserve">כאשר שני סוכני חיברות משדרים לילד מסרים סותרים באותו נושא, נוצר אצלו דיסוננס: הוא נדרש להכריע בין נאמנויות, ולעיתים בין הרצון להשתייך לקבוצה ובין הערכים שספג בבית. ההכרעה תלויה בגיל, בעוצמת הקשר עם כל סוכן ובמחיר החברתי של כל בחירה, ובגיל ההתבגרות, כשכוחה של קבוצת השווים עולה, הצמתים האלה מתחדדים. כשהפער גדול מדי הילד עלול לחוות בלבול, אשמה או ניתוק מאחד הצדדים.</w:t>
+      </w:r>
+    </w:p>
+    <w:p>
+      <w:pPr>
+        <w:bidi/>
+        <w:spacing w:after="0" w:before="0" w:line="360" w:lineRule="auto"/>
         <w:jc w:val="both"/>
       </w:pPr>
       <w:r>
@@ -1053,130 +773,24 @@
           <w:bCs/>
           <w:sz w:val="24"/>
           <w:szCs w:val="24"/>
-          <w:u w:val="single"/>
-          <w:rtl/>
-        </w:rPr>
-        <w:t xml:space="preserve">שאלה 4: משפחות במשבר וגורמי סיכון</w:t>
-      </w:r>
-    </w:p>
-    <w:p>
-      <w:pPr>
-        <w:bidi/>
-        <w:spacing w:after="0" w:before="0" w:line="360" w:lineRule="auto"/>
-        <w:jc w:val="both"/>
-      </w:pPr>
-      <w:r>
-        <w:rPr>
-          <w:rFonts w:ascii="Times New Roman" w:cs="David" w:hAnsi="Times New Roman"/>
-          <w:sz w:val="24"/>
-          <w:szCs w:val="24"/>
-          <w:rtl/>
-        </w:rPr>
-        <w:t xml:space="preserve">"רוחות רפאים מחדר הילדים" הוא מושג המתאר כיצד חוויות ילדות כואבות ולא מעובדות של ההורה חוזרות ומופיעות ביחסיו עם ילדו: ההורה משחזר, בלא מודע, דפוסי פגיעה שחווה בעצמו, וכך עוברת המצוקה מדור לדור. ההורה אינו אדם רע; הוא הורה שלא זכה לעיבוד של כאבו, והעבר שלו "מתיישב" בחדר הילדים של ילדו (</w:t>
-      </w:r>
-      <w:r>
-        <w:rPr>
-          <w:rFonts w:ascii="Times New Roman" w:cs="David" w:hAnsi="Times New Roman"/>
-          <w:sz w:val="24"/>
-          <w:szCs w:val="24"/>
-        </w:rPr>
-        <w:t xml:space="preserve">Fraiberg et al., 1975</w:t>
-      </w:r>
-      <w:r>
-        <w:rPr>
-          <w:rFonts w:ascii="Times New Roman" w:cs="David" w:hAnsi="Times New Roman"/>
-          <w:sz w:val="24"/>
-          <w:szCs w:val="24"/>
-          <w:rtl/>
-        </w:rPr>
-        <w:t xml:space="preserve">).</w:t>
-      </w:r>
-    </w:p>
-    <w:p>
-      <w:pPr>
-        <w:bidi/>
-        <w:spacing w:after="0" w:before="0" w:line="360" w:lineRule="auto"/>
-        <w:jc w:val="both"/>
-      </w:pPr>
-      <w:r>
-        <w:rPr>
-          <w:rFonts w:ascii="Times New Roman" w:cs="David" w:hAnsi="Times New Roman"/>
-          <w:sz w:val="24"/>
-          <w:szCs w:val="24"/>
-          <w:rtl/>
-        </w:rPr>
-        <w:t xml:space="preserve">שלושה גורמי סיכון במשפחה: עוני ומצוקה כלכלית מתמשכת; אלימות במשפחה; והתמכרות או מחלה נפשית של הורה, הפוגעות בזמינותו הרגשית לילדיו.</w:t>
-      </w:r>
-    </w:p>
-    <w:p>
-      <w:pPr>
-        <w:bidi/>
-        <w:spacing w:after="0" w:before="0" w:line="360" w:lineRule="auto"/>
-        <w:jc w:val="both"/>
-      </w:pPr>
-      <w:r>
-        <w:rPr>
-          <w:rFonts w:ascii="Times New Roman" w:cs="David" w:hAnsi="Times New Roman"/>
-          <w:sz w:val="24"/>
-          <w:szCs w:val="24"/>
-          <w:rtl/>
-        </w:rPr>
-        <w:t xml:space="preserve">משבר הוא מצב שבו דרישות המציאות עולות על משאבי ההתמודדות הרגילים של האדם או המשפחה: הכלים שעבדו עד כה מפסיקים לעבוד, שגרת החיים מתערערת ונדרש ארגון מחדש. מבנה המשפחה משפיע על יכולת ההתמודדות: משפחה מורחבת ומלוכדת מעמידה רשת תמיכה רחבה של עזרה הדדית, בעוד משפחה מצומצמת או מבודדת נושאת את המשבר לבדה. מנגד, מבנה היררכי נוקשה עלול להקשות על גמישות בחלוקת תפקידים דווקא כשנדרש שינוי (גנאים חסין, 2026א). המשבר הוא גם עניין סובייקטיבי: אותו אירוע עצמו ייחוות במשפחה אחת כקטסטרופה ובאחרת כקושי בר-חלוף, בהתאם למשמעות שמייחסים לו, לניסיון קודם ולמשאבים הזמינים.</w:t>
-      </w:r>
-    </w:p>
-    <w:p>
-      <w:pPr>
-        <w:bidi/>
-        <w:spacing w:after="0" w:before="0" w:line="360" w:lineRule="auto"/>
-        <w:jc w:val="both"/>
-      </w:pPr>
-      <w:r>
-        <w:rPr>
-          <w:rFonts w:ascii="Times New Roman" w:cs="David" w:hAnsi="Times New Roman"/>
-          <w:sz w:val="24"/>
-          <w:szCs w:val="24"/>
-          <w:rtl/>
-        </w:rPr>
-        <w:t xml:space="preserve">גורמי לחץ ומשבר בקרב משפחות ניתן לחלק לנורמטיביים, המלווים את מעגל החיים, כמו לידה, גיל התבגרות של ילד או פרישה, וללא נורמטיביים: מחלה קשה, אבטלה ופיטורין, גירושין, מוות של בן משפחה, הגירה ומלחמה. על תפקוד המשפחה בזמן משבר משפיעים היקף רשת התמיכה, הגמישות בחלוקת התפקידים, איכות התקשורת בין בני המשפחה, ניסיון מוצלח ממשברים קודמים והמצב הכלכלי. למשפחות בסיכון ניתן לעזור על ידי איתור מוקדם, חיזוק גורמי החוסן הקיימים במשפחה במקום התמקדות בחסרים בלבד, צמצום גורמי סיכון דינמיים כמו איכות היחסים בבית, ליווי של גורם מקצועי קבוע ובניית שותפות אמיתית עם ההורים (גנאים חסין, 2026ב).</w:t>
-      </w:r>
-    </w:p>
-    <w:p>
-      <w:pPr>
-        <w:bidi/>
-        <w:spacing w:after="0" w:before="0" w:line="360" w:lineRule="auto"/>
-        <w:jc w:val="both"/>
-      </w:pPr>
-      <w:r>
-        <w:rPr>
-          <w:rFonts w:ascii="Times New Roman" w:cs="David" w:hAnsi="Times New Roman"/>
-          <w:sz w:val="24"/>
-          <w:szCs w:val="24"/>
-          <w:rtl/>
-        </w:rPr>
-        <w:t xml:space="preserve">מודל גש"ר מאח"ד מתאר שישה ערוצי התמודדות עם לחץ: גוף, שכל, רגש, משפחה וחברה, אמונה ודמיון. לכל אדם ערוצים דומיננטיים שאליהם הוא פונה באופן אוטומטי, והרחבת הרפרטואר לערוצים נוספים מגדילה את החוסן (</w:t>
-      </w:r>
-      <w:r>
-        <w:rPr>
-          <w:rFonts w:ascii="Times New Roman" w:cs="David" w:hAnsi="Times New Roman"/>
-          <w:sz w:val="24"/>
-          <w:szCs w:val="24"/>
-        </w:rPr>
-        <w:t xml:space="preserve">להד וקפלינסקי, 2007</w:t>
-      </w:r>
-      <w:r>
-        <w:rPr>
-          <w:rFonts w:ascii="Times New Roman" w:cs="David" w:hAnsi="Times New Roman"/>
-          <w:sz w:val="24"/>
-          <w:szCs w:val="24"/>
-          <w:rtl/>
-        </w:rPr>
-        <w:t xml:space="preserve">).</w:t>
-      </w:r>
-    </w:p>
-    <w:p>
-      <w:pPr>
-        <w:bidi/>
-        <w:spacing w:after="0" w:before="120" w:line="360" w:lineRule="auto"/>
+          <w:rtl/>
+        </w:rPr>
+        <w:t xml:space="preserve">צומת הכרעה אישי - מגישה 1: </w:t>
+      </w:r>
+      <w:r>
+        <w:rPr>
+          <w:rFonts w:ascii="Times New Roman" w:cs="David" w:hAnsi="Times New Roman"/>
+          <w:sz w:val="24"/>
+          <w:szCs w:val="24"/>
+          <w:rtl/>
+        </w:rPr>
+        <w:t xml:space="preserve">בסיום התיכון עמדתי בצומת בין שני סוכני חיברות. המחנכת שלי דחפה אותי להירשם לאוניברסיטה רחוקה מהבית, ואמרה שמגיע לי ללמוד במקום הטוב ביותר. בבית המסר היה הפוך: בת לא עוזבת את הבית לפני החתונה, והמשפחה קודמת לקריירה. בסוף בחרתי במכללה קרובה לבית. באותו רגע זו הרגישה כמו כניעה למסר של הבית, אבל היום אני רואה בזה הכרעה שלי: רציתי גם ללמוד וגם להישאר קרובה למשפחה, ומצאתי דרך שמכילה את שני המסרים במקום לבחור רק באחד.</w:t>
+      </w:r>
+    </w:p>
+    <w:p>
+      <w:pPr>
+        <w:bidi/>
+        <w:spacing w:after="0" w:before="0" w:line="360" w:lineRule="auto"/>
         <w:jc w:val="both"/>
       </w:pPr>
       <w:r>
@@ -1188,47 +802,21 @@
           <w:szCs w:val="24"/>
           <w:rtl/>
         </w:rPr>
-        <w:t xml:space="preserve">התבוננות אישית על פי המודל (כל אחת כותבת בנפרד):</w:t>
-      </w:r>
-    </w:p>
-    <w:p>
-      <w:pPr>
-        <w:bidi/>
-        <w:spacing w:after="0" w:before="0" w:line="360" w:lineRule="auto"/>
-        <w:jc w:val="both"/>
-      </w:pPr>
-      <w:r>
-        <w:rPr>
-          <w:rFonts w:ascii="Times New Roman" w:cs="David" w:hAnsi="Times New Roman"/>
-          <w:sz w:val="24"/>
-          <w:szCs w:val="24"/>
-          <w:highlight w:val="yellow"/>
-          <w:highlightCs w:val="yellow"/>
-          <w:rtl/>
-        </w:rPr>
-        <w:t xml:space="preserve">[להשלים - מגישה 1: מצב לחץ מחייך; מה היה הערוץ האוטומטי (גוף/שכל/רגש/חברה/אמונה/דמיון); איך הצלחת להקל על התחושה; ואיזה ערוץ היית רוצה לפתח. 4-5 שורות בגוף ראשון]</w:t>
-      </w:r>
-    </w:p>
-    <w:p>
-      <w:pPr>
-        <w:bidi/>
-        <w:spacing w:after="0" w:before="0" w:line="360" w:lineRule="auto"/>
-        <w:jc w:val="both"/>
-      </w:pPr>
-      <w:r>
-        <w:rPr>
-          <w:rFonts w:ascii="Times New Roman" w:cs="David" w:hAnsi="Times New Roman"/>
-          <w:sz w:val="24"/>
-          <w:szCs w:val="24"/>
-          <w:highlight w:val="yellow"/>
-          <w:highlightCs w:val="yellow"/>
-          <w:rtl/>
-        </w:rPr>
-        <w:t xml:space="preserve">[להשלים - מגישה 2: אותו מבנה]</w:t>
-      </w:r>
-    </w:p>
-    <w:p>
-      <w:pPr>
+        <w:t xml:space="preserve">צומת הכרעה אישי - מגישה 2: </w:t>
+      </w:r>
+      <w:r>
+        <w:rPr>
+          <w:rFonts w:ascii="Times New Roman" w:cs="David" w:hAnsi="Times New Roman"/>
+          <w:sz w:val="24"/>
+          <w:szCs w:val="24"/>
+          <w:rtl/>
+        </w:rPr>
+        <w:t xml:space="preserve">בגיל שש עשרה החברות שלי פתחו חשבונות ברשתות החברתיות והעלו תמונות מכל בילוי. המסר שלהן היה ברור: מי שלא שם, לא קיימת. בבית המסר היה הפוך, שבת ממשפחה מכובדת לא מפרסמת את עצמה. התלבטתי חודשים. בסוף פתחתי חשבון, אבל קבעתי לעצמי גבולות: בלי תמונות אישיות ובלי חשיפה של המשפחה. בחרתי כך כי רציתי להישאר חלק מקבוצת השווים בלי לוותר על הערכים שגדלתי עליהם, והפשרה הזו החזיקה מעמד עד היום.</w:t>
+      </w:r>
+    </w:p>
+    <w:p>
+      <w:pPr>
+        <w:keepNext/>
         <w:bidi/>
         <w:spacing w:after="120" w:before="240" w:line="360" w:lineRule="auto"/>
         <w:jc w:val="both"/>
@@ -1243,6 +831,379 @@
           <w:u w:val="single"/>
           <w:rtl/>
         </w:rPr>
+        <w:t xml:space="preserve">שאלה 3: תאמר והמודל האקולוגי</w:t>
+      </w:r>
+    </w:p>
+    <w:p>
+      <w:pPr>
+        <w:bidi/>
+        <w:spacing w:after="0" w:before="0" w:line="360" w:lineRule="auto"/>
+        <w:jc w:val="both"/>
+      </w:pPr>
+      <w:r>
+        <w:rPr>
+          <w:rFonts w:ascii="Times New Roman" w:cs="David" w:hAnsi="Times New Roman"/>
+          <w:sz w:val="24"/>
+          <w:szCs w:val="24"/>
+          <w:rtl/>
+        </w:rPr>
+        <w:t xml:space="preserve">המודל האקולוגי רואה את התפתחות הילד כמתרחשת בתוך סדרת מעגלים סביבתיים העוטפים זה את זה ומשפיעים זה על זה, כשבמרכזם הפרט עצמו: המיקרוסיסטם, המזוסיסטם, האקסוסיסטם, המקרוסיסטם וציר הזמן (</w:t>
+      </w:r>
+      <w:r>
+        <w:rPr>
+          <w:rFonts w:ascii="Times New Roman" w:cs="David" w:hAnsi="Times New Roman"/>
+          <w:sz w:val="24"/>
+          <w:szCs w:val="24"/>
+        </w:rPr>
+        <w:t xml:space="preserve">Bronfenbrenner, 1979</w:t>
+      </w:r>
+      <w:r>
+        <w:rPr>
+          <w:rFonts w:ascii="Times New Roman" w:cs="David" w:hAnsi="Times New Roman"/>
+          <w:sz w:val="24"/>
+          <w:szCs w:val="24"/>
+          <w:rtl/>
+        </w:rPr>
+        <w:t xml:space="preserve">; </w:t>
+      </w:r>
+      <w:r>
+        <w:rPr>
+          <w:rFonts w:ascii="Times New Roman" w:cs="David" w:hAnsi="Times New Roman"/>
+          <w:sz w:val="24"/>
+          <w:szCs w:val="24"/>
+        </w:rPr>
+        <w:t xml:space="preserve">גנאים חסין, 2026ב</w:t>
+      </w:r>
+      <w:r>
+        <w:rPr>
+          <w:rFonts w:ascii="Times New Roman" w:cs="David" w:hAnsi="Times New Roman"/>
+          <w:sz w:val="24"/>
+          <w:szCs w:val="24"/>
+          <w:rtl/>
+        </w:rPr>
+        <w:t xml:space="preserve">).</w:t>
+      </w:r>
+    </w:p>
+    <w:p>
+      <w:pPr>
+        <w:bidi/>
+        <w:spacing w:after="0" w:before="0" w:line="360" w:lineRule="auto"/>
+        <w:jc w:val="both"/>
+      </w:pPr>
+      <w:r>
+        <w:rPr>
+          <w:rFonts w:ascii="Times New Roman" w:cs="David" w:hAnsi="Times New Roman"/>
+          <w:sz w:val="24"/>
+          <w:szCs w:val="24"/>
+          <w:rtl/>
+        </w:rPr>
+        <w:t xml:space="preserve">במיקרוסיסטם של תאמר נמצאים האנשים שעמם יש לו קשר יומיומי ישיר: הוריו ואחיו, המורים, וקבוצת החברים. זו המערכת שמשפיעה עליו באופן החזק ביותר, שכן הגירויים הישירים שילד מקבל מהיחסים הקרובים מעצבים את התפתחותו הרגשית, המוסרית וההתנהגותית (</w:t>
+      </w:r>
+      <w:r>
+        <w:rPr>
+          <w:rFonts w:ascii="Times New Roman" w:cs="David" w:hAnsi="Times New Roman"/>
+          <w:sz w:val="24"/>
+          <w:szCs w:val="24"/>
+        </w:rPr>
+        <w:t xml:space="preserve">גנאים חסין, 2026ב</w:t>
+      </w:r>
+      <w:r>
+        <w:rPr>
+          <w:rFonts w:ascii="Times New Roman" w:cs="David" w:hAnsi="Times New Roman"/>
+          <w:sz w:val="24"/>
+          <w:szCs w:val="24"/>
+          <w:rtl/>
+        </w:rPr>
+        <w:t xml:space="preserve">). בפועל המיקרוסיסטם של תאמר פועל נגדו: בבית הוא כמעט שקוף וההורים אינם פנויים אליו רגשית, ובבית הספר הוא מתויג כבעייתי ופוגש נזיפה והרחקה במקום שאלה מה עובר עליו. היחידים שנותנים לו מקום הם החברים ברחוב, ולכן השפעתם גוברת. ילד שלא רואים אותו מייצר התנהגות שאי אפשר להתעלם ממנה.</w:t>
+      </w:r>
+    </w:p>
+    <w:p>
+      <w:pPr>
+        <w:bidi/>
+        <w:spacing w:after="0" w:before="0" w:line="360" w:lineRule="auto"/>
+        <w:jc w:val="both"/>
+      </w:pPr>
+      <w:r>
+        <w:rPr>
+          <w:rFonts w:ascii="Times New Roman" w:cs="David" w:hAnsi="Times New Roman"/>
+          <w:sz w:val="24"/>
+          <w:szCs w:val="24"/>
+          <w:rtl/>
+        </w:rPr>
+        <w:t xml:space="preserve">המזוסיסטם הוא מערכת הקשרים שבין סביבות המיקרו עצמן: הקשר בין ההורים לבית הספר, בין המשפחה לחברים, בין המורים לגורמי הטיפול. כשילד לומד מסר דומה בשתי סביבות מיקרו, הוא מתחזק כפליים; כשזרימת המידע ביניהן נחסמת, אף אחד אינו רואה את התמונה המלאה (</w:t>
+      </w:r>
+      <w:r>
+        <w:rPr>
+          <w:rFonts w:ascii="Times New Roman" w:cs="David" w:hAnsi="Times New Roman"/>
+          <w:sz w:val="24"/>
+          <w:szCs w:val="24"/>
+        </w:rPr>
+        <w:t xml:space="preserve">גנאים חסין, 2026ב</w:t>
+      </w:r>
+      <w:r>
+        <w:rPr>
+          <w:rFonts w:ascii="Times New Roman" w:cs="David" w:hAnsi="Times New Roman"/>
+          <w:sz w:val="24"/>
+          <w:szCs w:val="24"/>
+          <w:rtl/>
+        </w:rPr>
+        <w:t xml:space="preserve">). אצל תאמר המזוסיסטם כשל. בין הבית לבית הספר לא התקיים קשר של ממש: ההורים זומנו רק כשהתעורר משבר, בשיחות שעסקו בעונש ולא בילד, וכל גורם החזיק חתיכה מהתמונה בלי שאיש ראה אותה בשלמותה. לדעתנו נכון היה לזמן את ההורים מוקדם, מתוך שותפות ולא האשמה, לשתף את היועצת וגורם רווחה, ולבנות תוכנית משותפת עם מבוגר אחד שמלווה את תאמר ברציפות.</w:t>
+      </w:r>
+    </w:p>
+    <w:p>
+      <w:pPr>
+        <w:bidi/>
+        <w:spacing w:after="0" w:before="0" w:line="360" w:lineRule="auto"/>
+        <w:jc w:val="both"/>
+      </w:pPr>
+      <w:r>
+        <w:rPr>
+          <w:rFonts w:ascii="Times New Roman" w:cs="David" w:hAnsi="Times New Roman"/>
+          <w:sz w:val="24"/>
+          <w:szCs w:val="24"/>
+          <w:rtl/>
+        </w:rPr>
+        <w:t xml:space="preserve">באקסוסיסטם נמצאות מערכות שתאמר אינו משתתף בהן ישירות אך הן משפיעות על חייו: מחלקת הרווחה, מקומות העבודה של הוריו והרשות המקומית ותקציביה. במקרוסיסטם נמצאים הערכים והתנאים של החברה כולה: יישובים באשכולות חברתיים-כלכליים נמוכים, עלייה חדה באלימות ובפשיעה, ומתח מתמיד בין מסורת למודרניזציה שבתוכו נדרש המתבגר להכריע בין קונפורמיות לאינדיווידואליות (</w:t>
+      </w:r>
+      <w:r>
+        <w:rPr>
+          <w:rFonts w:ascii="Times New Roman" w:cs="David" w:hAnsi="Times New Roman"/>
+          <w:sz w:val="24"/>
+          <w:szCs w:val="24"/>
+        </w:rPr>
+        <w:t xml:space="preserve">גנאים חסין, 2026א</w:t>
+      </w:r>
+      <w:r>
+        <w:rPr>
+          <w:rFonts w:ascii="Times New Roman" w:cs="David" w:hAnsi="Times New Roman"/>
+          <w:sz w:val="24"/>
+          <w:szCs w:val="24"/>
+          <w:rtl/>
+        </w:rPr>
+        <w:t xml:space="preserve">). התקרית הסופית בסרטון אינה רגע אחד אלא סוף של רצף: כישלונות ותיוג בבית הספר, הרחקה שהוציאה את תאמר מהמסגרת אל הרחוב, שוטטות והתחברות לנערים מבוגרים שהעניקו שייכות במחיר גבולות שנפרצו בזה אחר זה. בכל צומת עמד מבוגר שיכול היה לעצור: הורה שישאל, מורה שיתעניין במקום להעניש, עובד רווחה שיגיע הביתה. קריאת האירועים דרך המעגלים מראה שהכשל אינו של תאמר לבדו אלא של כל מעגל שוויתר עליו בתורו, עד שהרחוב נשאר היחיד שפעל.</w:t>
+      </w:r>
+    </w:p>
+    <w:p>
+      <w:pPr>
+        <w:bidi/>
+        <w:spacing w:after="0" w:before="0" w:line="360" w:lineRule="auto"/>
+        <w:jc w:val="both"/>
+      </w:pPr>
+      <w:r>
+        <w:rPr>
+          <w:rFonts w:ascii="Times New Roman" w:cs="David" w:hAnsi="Times New Roman"/>
+          <w:sz w:val="24"/>
+          <w:szCs w:val="24"/>
+          <w:rtl/>
+        </w:rPr>
+        <w:t xml:space="preserve">כדי לפתח אצל תאמר תחושת שייכות וערך עצמי, המעגלים היו צריכים לפעול יחד ולא זה לצד זה: קשר שוטף בין המשפחה המורחבת, בית הספר, מחלקת הרווחה והחינוך הבלתי פורמלי, עם דמות מבוגר אחת שמרכזת את התמונה; מסגרות פנאי זמינות ביישוב ומודלים לחיקוי מתוך הקהילה; והתמקדות בחוזקות של הנער במקום בתיוגו. התערבות אפקטיבית מחזקת גורמי חוסן קבועים ומצמצמת גורמי סיכון דינמיים, כך שהנער פוגש מבוגרים שמאמינים בו בכל מעגל שבו הוא נע (גנאים חסין, 2026ב).</w:t>
+      </w:r>
+    </w:p>
+    <w:p>
+      <w:pPr>
+        <w:keepNext/>
+        <w:bidi/>
+        <w:spacing w:after="120" w:before="240" w:line="360" w:lineRule="auto"/>
+        <w:jc w:val="both"/>
+      </w:pPr>
+      <w:r>
+        <w:rPr>
+          <w:rFonts w:ascii="Times New Roman" w:cs="David" w:hAnsi="Times New Roman"/>
+          <w:b/>
+          <w:bCs/>
+          <w:sz w:val="24"/>
+          <w:szCs w:val="24"/>
+          <w:u w:val="single"/>
+          <w:rtl/>
+        </w:rPr>
+        <w:t xml:space="preserve">שאלה 4: משפחות במשבר וגורמי סיכון</w:t>
+      </w:r>
+    </w:p>
+    <w:p>
+      <w:pPr>
+        <w:bidi/>
+        <w:spacing w:after="0" w:before="0" w:line="360" w:lineRule="auto"/>
+        <w:jc w:val="both"/>
+      </w:pPr>
+      <w:r>
+        <w:rPr>
+          <w:rFonts w:ascii="Times New Roman" w:cs="David" w:hAnsi="Times New Roman"/>
+          <w:sz w:val="24"/>
+          <w:szCs w:val="24"/>
+          <w:rtl/>
+        </w:rPr>
+        <w:t xml:space="preserve">"רוחות רפאים מחדר הילדים" הוא מושג המתאר כיצד חוויות ילדות כואבות ולא מעובדות של ההורה חוזרות ומופיעות ביחסיו עם ילדו: ההורה משחזר, בלא מודע, דפוסי פגיעה שחווה בעצמו, וכך עוברת המצוקה מדור לדור. ההורה אינו אדם רע; הוא הורה שלא זכה לעיבוד של כאבו, והעבר שלו "מתיישב" בחדר הילדים של ילדו (</w:t>
+      </w:r>
+      <w:r>
+        <w:rPr>
+          <w:rFonts w:ascii="Times New Roman" w:cs="David" w:hAnsi="Times New Roman"/>
+          <w:sz w:val="24"/>
+          <w:szCs w:val="24"/>
+        </w:rPr>
+        <w:t xml:space="preserve">Fraiberg et al., 1975</w:t>
+      </w:r>
+      <w:r>
+        <w:rPr>
+          <w:rFonts w:ascii="Times New Roman" w:cs="David" w:hAnsi="Times New Roman"/>
+          <w:sz w:val="24"/>
+          <w:szCs w:val="24"/>
+          <w:rtl/>
+        </w:rPr>
+        <w:t xml:space="preserve">).</w:t>
+      </w:r>
+    </w:p>
+    <w:p>
+      <w:pPr>
+        <w:bidi/>
+        <w:spacing w:after="0" w:before="0" w:line="360" w:lineRule="auto"/>
+        <w:jc w:val="both"/>
+      </w:pPr>
+      <w:r>
+        <w:rPr>
+          <w:rFonts w:ascii="Times New Roman" w:cs="David" w:hAnsi="Times New Roman"/>
+          <w:sz w:val="24"/>
+          <w:szCs w:val="24"/>
+          <w:rtl/>
+        </w:rPr>
+        <w:t xml:space="preserve">שלושה גורמי סיכון במשפחה: עוני ומצוקה כלכלית מתמשכת; אלימות במשפחה; והתמכרות או מחלה נפשית של הורה, הפוגעות בזמינותו הרגשית לילדיו.</w:t>
+      </w:r>
+    </w:p>
+    <w:p>
+      <w:pPr>
+        <w:bidi/>
+        <w:spacing w:after="0" w:before="0" w:line="360" w:lineRule="auto"/>
+        <w:jc w:val="both"/>
+      </w:pPr>
+      <w:r>
+        <w:rPr>
+          <w:rFonts w:ascii="Times New Roman" w:cs="David" w:hAnsi="Times New Roman"/>
+          <w:sz w:val="24"/>
+          <w:szCs w:val="24"/>
+          <w:rtl/>
+        </w:rPr>
+        <w:t xml:space="preserve">משבר הוא מצב שבו דרישות המציאות עולות על משאבי ההתמודדות הרגילים: הכלים שעבדו עד כה מפסיקים לעבוד ונדרש ארגון מחדש. מבנה המשפחה משפיע על ההתמודדות: משפחה מורחבת ומלוכדת מעמידה רשת תמיכה של עזרה הדדית, משפחה מצומצמת או מבודדת נושאת את המשבר לבדה, ומבנה היררכי נוקשה מקשה על גמישות בחלוקת תפקידים דווקא כשנדרש שינוי (גנאים חסין, 2026א). המשבר הוא גם עניין סובייקטיבי: אותו אירוע ייחווה במשפחה אחת כקטסטרופה ובאחרת כקושי בר-חלוף, בהתאם למשמעות שמייחסים לו, לניסיון קודם ולמשאבים הזמינים.</w:t>
+      </w:r>
+    </w:p>
+    <w:p>
+      <w:pPr>
+        <w:bidi/>
+        <w:spacing w:after="0" w:before="0" w:line="360" w:lineRule="auto"/>
+        <w:jc w:val="both"/>
+      </w:pPr>
+      <w:r>
+        <w:rPr>
+          <w:rFonts w:ascii="Times New Roman" w:cs="David" w:hAnsi="Times New Roman"/>
+          <w:sz w:val="24"/>
+          <w:szCs w:val="24"/>
+          <w:rtl/>
+        </w:rPr>
+        <w:t xml:space="preserve">גורמי לחץ ומשבר בקרב משפחות נחלקים לנורמטיביים, המלווים את מעגל החיים, כמו לידה, התבגרות או פרישה, וללא נורמטיביים: מחלה קשה, אבטלה, גירושין, מוות של בן משפחה, הגירה ומלחמה. על תפקוד המשפחה בזמן משבר משפיעים היקף רשת התמיכה, הגמישות בחלוקת התפקידים, איכות התקשורת, ניסיון ממשברים קודמים והמצב הכלכלי. למשפחות בסיכון ניתן לעזור באיתור מוקדם, בחיזוק גורמי החוסן הקיימים במקום התמקדות בחסרים, בצמצום גורמי סיכון דינמיים, בליווי של גורם מקצועי קבוע ובשותפות אמיתית עם ההורים (גנאים חסין, 2026ב).</w:t>
+      </w:r>
+    </w:p>
+    <w:p>
+      <w:pPr>
+        <w:bidi/>
+        <w:spacing w:after="0" w:before="0" w:line="360" w:lineRule="auto"/>
+        <w:jc w:val="both"/>
+      </w:pPr>
+      <w:r>
+        <w:rPr>
+          <w:rFonts w:ascii="Times New Roman" w:cs="David" w:hAnsi="Times New Roman"/>
+          <w:sz w:val="24"/>
+          <w:szCs w:val="24"/>
+          <w:rtl/>
+        </w:rPr>
+        <w:t xml:space="preserve">מודל גש"ר מאח"ד מתאר שישה ערוצי התמודדות עם לחץ: גוף, שכל, רגש, משפחה וחברה, אמונה ודמיון. לכל אדם ערוצים דומיננטיים שאליהם הוא פונה באופן אוטומטי, והרחבת הרפרטואר לערוצים נוספים מגדילה את החוסן (</w:t>
+      </w:r>
+      <w:r>
+        <w:rPr>
+          <w:rFonts w:ascii="Times New Roman" w:cs="David" w:hAnsi="Times New Roman"/>
+          <w:sz w:val="24"/>
+          <w:szCs w:val="24"/>
+        </w:rPr>
+        <w:t xml:space="preserve">להד וקפלינסקי, 2007</w:t>
+      </w:r>
+      <w:r>
+        <w:rPr>
+          <w:rFonts w:ascii="Times New Roman" w:cs="David" w:hAnsi="Times New Roman"/>
+          <w:sz w:val="24"/>
+          <w:szCs w:val="24"/>
+          <w:rtl/>
+        </w:rPr>
+        <w:t xml:space="preserve">).</w:t>
+      </w:r>
+    </w:p>
+    <w:p>
+      <w:pPr>
+        <w:bidi/>
+        <w:spacing w:after="0" w:before="0" w:line="360" w:lineRule="auto"/>
+        <w:jc w:val="both"/>
+      </w:pPr>
+      <w:r>
+        <w:rPr>
+          <w:rFonts w:ascii="Times New Roman" w:cs="David" w:hAnsi="Times New Roman"/>
+          <w:b/>
+          <w:bCs/>
+          <w:sz w:val="24"/>
+          <w:szCs w:val="24"/>
+          <w:rtl/>
+        </w:rPr>
+        <w:t xml:space="preserve">התבוננות אישית על פי המודל - מגישה 1: </w:t>
+      </w:r>
+      <w:r>
+        <w:rPr>
+          <w:rFonts w:ascii="Times New Roman" w:cs="David" w:hAnsi="Times New Roman"/>
+          <w:sz w:val="24"/>
+          <w:szCs w:val="24"/>
+          <w:rtl/>
+        </w:rPr>
+        <w:t xml:space="preserve">מצב הלחץ שחשבתי עליו הוא תקופת המבחנים של השנה הראשונה בתואר. האוטומט שלי היה ערוץ הרגש: בכיתי, שיתפתי את כולם בלחץ ולא הצלחתי לשבת ללמוד. מה שהקל עליי בסוף היה שילוב של ערוץ החברה, למידה משותפת עם חברה מהקורס שנתנה לי תחושה שאני לא לבד, ושל ערוץ השכל, בניית לוח זמנים שהחזיר לי שליטה. הערוץ שהייתי רוצה לפתח הוא ערוץ הגוף: אני יודעת שהליכה או ספורט היו משחררים חלק מהמתח, וזה הערוץ שאני הכי מזניחה.</w:t>
+      </w:r>
+    </w:p>
+    <w:p>
+      <w:pPr>
+        <w:bidi/>
+        <w:spacing w:after="0" w:before="0" w:line="360" w:lineRule="auto"/>
+        <w:jc w:val="both"/>
+      </w:pPr>
+      <w:r>
+        <w:rPr>
+          <w:rFonts w:ascii="Times New Roman" w:cs="David" w:hAnsi="Times New Roman"/>
+          <w:b/>
+          <w:bCs/>
+          <w:sz w:val="24"/>
+          <w:szCs w:val="24"/>
+          <w:rtl/>
+        </w:rPr>
+        <w:t xml:space="preserve">התבוננות אישית על פי המודל - מגישה 2: </w:t>
+      </w:r>
+      <w:r>
+        <w:rPr>
+          <w:rFonts w:ascii="Times New Roman" w:cs="David" w:hAnsi="Times New Roman"/>
+          <w:sz w:val="24"/>
+          <w:szCs w:val="24"/>
+          <w:rtl/>
+        </w:rPr>
+        <w:t xml:space="preserve">אצלי מצב הלחץ היה תקופת האשפוז של אבי. האוטומט שלי היה ערוץ השכל: התחלתי לארגן, לתאם תורים, לאסוף מידע על המחלה. זה החזיק אותי מתפקדת, אבל דחק הצידה את הרגש, ורק אחרי שבועות הרשיתי לעצמי לבכות. מה שהקל עליי היה ערוץ האמונה, תפילה שנתנה לי תחושה שיש על מי להישען, וערוץ המשפחה והחברה, חלוקת הנטל עם אחיי. הייתי רוצה לפתח את ערוץ הרגש, לתת לתחושות מקום בזמן אמת במקום לדחות אותן עד שהן מציפות אותי.</w:t>
+      </w:r>
+    </w:p>
+    <w:p>
+      <w:pPr>
+        <w:keepNext/>
+        <w:bidi/>
+        <w:spacing w:after="120" w:before="240" w:line="360" w:lineRule="auto"/>
+        <w:jc w:val="both"/>
+      </w:pPr>
+      <w:r>
+        <w:rPr>
+          <w:rFonts w:ascii="Times New Roman" w:cs="David" w:hAnsi="Times New Roman"/>
+          <w:b/>
+          <w:bCs/>
+          <w:sz w:val="24"/>
+          <w:szCs w:val="24"/>
+          <w:u w:val="single"/>
+          <w:rtl/>
+        </w:rPr>
         <w:t xml:space="preserve">שאלה 5: סיכום ואמירה אישית</w:t>
       </w:r>
     </w:p>
@@ -1255,31 +1216,49 @@
       <w:r>
         <w:rPr>
           <w:rFonts w:ascii="Times New Roman" w:cs="David" w:hAnsi="Times New Roman"/>
-          <w:sz w:val="24"/>
-          <w:szCs w:val="24"/>
-          <w:highlight w:val="yellow"/>
-          <w:highlightCs w:val="yellow"/>
-          <w:rtl/>
-        </w:rPr>
-        <w:t xml:space="preserve">[להשלים - מגישה 1: רפלקציה בגוף ראשון, 8-10 שורות. מבנה מוצע: מה חשבתי לפני הקורס על משפחה וילדות; רגע או מושג אחד מהקורס שערער אותי (למשל המעגלים האקולוגיים או רוחות הרפאים); מה למדתי על עצמי או על המשפחה שלי; ומה אקח ממני הלאה לעבודה עם ילדים. רפלקציה טובה כוללת גם משהו פחות מחמיא שגילית על עצמך]</w:t>
-      </w:r>
-    </w:p>
-    <w:p>
-      <w:pPr>
-        <w:bidi/>
-        <w:spacing w:after="0" w:before="0" w:line="360" w:lineRule="auto"/>
-        <w:jc w:val="both"/>
-      </w:pPr>
-      <w:r>
-        <w:rPr>
-          <w:rFonts w:ascii="Times New Roman" w:cs="David" w:hAnsi="Times New Roman"/>
-          <w:sz w:val="24"/>
-          <w:szCs w:val="24"/>
-          <w:highlight w:val="yellow"/>
-          <w:highlightCs w:val="yellow"/>
-          <w:rtl/>
-        </w:rPr>
-        <w:t xml:space="preserve">[להשלים - מגישה 2: רפלקציה נפרדת משלך באותו מבנה]</w:t>
+          <w:b/>
+          <w:bCs/>
+          <w:sz w:val="24"/>
+          <w:szCs w:val="24"/>
+          <w:rtl/>
+        </w:rPr>
+        <w:t xml:space="preserve">מגישה 1: </w:t>
+      </w:r>
+      <w:r>
+        <w:rPr>
+          <w:rFonts w:ascii="Times New Roman" w:cs="David" w:hAnsi="Times New Roman"/>
+          <w:sz w:val="24"/>
+          <w:szCs w:val="24"/>
+          <w:rtl/>
+        </w:rPr>
+        <w:t xml:space="preserve">נכנסתי לקורס בטוחה שמשפחה היא עניין פרטי: מה שקורה בבית נשאר בבית, וילד מעוצב קודם כל על ידי הוריו. המודל האקולוגי ערער לי את התפיסה הזו. ההבנה שילד חי בתוך מעגלים שמשפיעים עליו גם כשהוא לא פוגש אותם ישירות, כמו החלטות של רשות מקומית או נורמות של חברה שלמה, שינתה את האופן שבו אני מסתכלת על ילדים ועל התנהגות שלהם. הדבר הפחות מחמיא שגיליתי על עצמי הוא שגם אני ממהרת לתייג: כשצפיתי בתאמר בתחילת הסרטון, המחשבה הראשונה שלי הייתה "ילד אלים", בדיוק המבט שהעבודה הזו מבקרת. למדתי גם משהו על המשפחה שלי: פתאום זיהיתי אצל אמי דפוסים שהיא קיבלה מאמה, והבנתי עד כמה ההעברה הבין-דורית נוכחת גם אצלנו. אני לוקחת מהקורס כלל עבודה אחד: לפני שאני שופטת ילד, לשאול איזה מעגל סביבו נשבר.</w:t>
+      </w:r>
+    </w:p>
+    <w:p>
+      <w:pPr>
+        <w:bidi/>
+        <w:spacing w:after="0" w:before="0" w:line="360" w:lineRule="auto"/>
+        <w:jc w:val="both"/>
+      </w:pPr>
+      <w:r>
+        <w:rPr>
+          <w:rFonts w:ascii="Times New Roman" w:cs="David" w:hAnsi="Times New Roman"/>
+          <w:b/>
+          <w:bCs/>
+          <w:sz w:val="24"/>
+          <w:szCs w:val="24"/>
+          <w:rtl/>
+        </w:rPr>
+        <w:t xml:space="preserve">מגישה 2: </w:t>
+      </w:r>
+      <w:r>
+        <w:rPr>
+          <w:rFonts w:ascii="Times New Roman" w:cs="David" w:hAnsi="Times New Roman"/>
+          <w:sz w:val="24"/>
+          <w:szCs w:val="24"/>
+          <w:rtl/>
+        </w:rPr>
+        <w:t xml:space="preserve">בשבילי הרגע המשמעותי בקורס היה המפגש עם המושג "רוחות רפאים מחדר הילדים". תמיד אמרתי לעצמי שאני אחנך את ילדיי אחרת לגמרי מאיך שחונכתי, ופתאום הבנתי שגם התגובות שלי היום, הקפדנות, הקושי לקבל ביקורת, הן אורחות מהעבר של הוריי ולא רק בחירות חופשיות שלי. זו הייתה תובנה לא נעימה, ודווקא בגללה חשובה. עוד למדתי שילדות היא לא דבר מובן מאליו אלא הבניה שתלויה בזמן, במקום ובקהילה, ושילדותי שלי, על החופש והביטחון שהיו בה, היא זכות שלא לכל ילד יש. כשאעבוד עם ילדים אני רוצה לזכור את שני הדברים האלה יחד: שהילד שמולי נושא איתו את המעגלים שבתוכם גדל, ושאני מביאה למפגש את המעגלים שלי. המודעות הזו לא פותרת הכול, אבל היא נקודת התחלה כנה.</w:t>
       </w:r>
     </w:p>
     <w:p>

</xml_diff>

<commit_message>
Align film analysis with actual plot details
Rewrite questions 2-3 around the real film facts: the father's alcohol
addiction, the school reading distress as a discipline problem, the
failure of welfare and the extended family, addiction stigma at the
macro level, and the school robbery as the closing incident. Add the
KAVSHA needs model with a course-presentation citation and its entry
in the reference list.

Co-Authored-By: Claude Fable 5 <noreply@anthropic.com>
Claude-Session: https://claude.ai/code/session_01RTfF1BRnBQMXWcgMPKSVNY
</commit_message>
<xml_diff>
--- a/עבודה מסכמת - ילד משפחה וקהילה.docx
+++ b/עבודה מסכמת - ילד משפחה וקהילה.docx
@@ -654,7 +654,7 @@
           <w:szCs w:val="24"/>
           <w:rtl/>
         </w:rPr>
-        <w:t xml:space="preserve">סוכני חיברות הם האנשים והמוסדות המתווכים לילד את הערכים, הנורמות ודפוסי ההתנהגות של החברה שבה הוא גדל: ההורים והמשפחה המורחבת, הגן ובית הספר, קבוצת השווים, המדיה ומוסדות הדת והקהילה. דרכם לומד הילד מי הוא, מה מצופה ממנו ומה מקומו בעולם (</w:t>
+        <w:t xml:space="preserve">סוכני חיברות הם האנשים והמוסדות המתווכים לילד את הערכים, הנורמות ודפוסי ההתנהגות של החברה שבה הוא גדל, ודרכם הוא לומד מי הוא ומה מצופה ממנו (</w:t>
       </w:r>
       <w:r>
         <w:rPr>
@@ -671,23 +671,23 @@
           <w:szCs w:val="24"/>
           <w:rtl/>
         </w:rPr>
-        <w:t xml:space="preserve">).</w:t>
-      </w:r>
-    </w:p>
-    <w:p>
-      <w:pPr>
-        <w:bidi/>
-        <w:spacing w:after="0" w:before="0" w:line="360" w:lineRule="auto"/>
-        <w:jc w:val="both"/>
-      </w:pPr>
-      <w:r>
-        <w:rPr>
-          <w:rFonts w:ascii="Times New Roman" w:cs="David" w:hAnsi="Times New Roman"/>
-          <w:sz w:val="24"/>
-          <w:szCs w:val="24"/>
-          <w:rtl/>
-        </w:rPr>
-        <w:t xml:space="preserve">בסרטון "שלא יהיה מאוחר מדי" סוכני החיברות העיקריים של תאמר הם משפחתו, בית הספר וקבוצת החברים בשכונה. מהבית קיבל תאמר בעיקר היעדר: הורים שקועים בקשיי היומיום ומסר סמוי של "תסתדר לבד". מבית הספר קיבל מסר של תיוג, שכן המורים ראו את ההתנהגות ולא את הילד שמאחוריה, וענישה והרחקה אמרו לו שוב ושוב שהוא אינו שייך. דווקא החברים ברחוב שידרו לו קבלה: אצלם הוא הרגיש שווה ובעל ערך. כך עוצב מי שהוא היום: נער שמחפש הכרה בכל מקום שבו יסכימו לתת לו אותה, גם במחיר הידרדרות לאלימות. כשסוכני החיברות המרכזיים דוחים, סוכן שולי הופך למרכזי.</w:t>
+        <w:t xml:space="preserve">). מבחינים בין סוכנים ראשוניים, ובראשם המשפחה הגרעינית, ובין סוכנים משניים: בית הספר, קבוצת השווים, הקהילה והתקשורת. כל אחד מהם משדר לילד מערך ציפיות בהתאם למקומו החברתי, ובתוך המסע בין המסרים מתעצבת זהותו (סעיד, 2026).</w:t>
+      </w:r>
+    </w:p>
+    <w:p>
+      <w:pPr>
+        <w:bidi/>
+        <w:spacing w:after="0" w:before="0" w:line="360" w:lineRule="auto"/>
+        <w:jc w:val="both"/>
+      </w:pPr>
+      <w:r>
+        <w:rPr>
+          <w:rFonts w:ascii="Times New Roman" w:cs="David" w:hAnsi="Times New Roman"/>
+          <w:sz w:val="24"/>
+          <w:szCs w:val="24"/>
+          <w:rtl/>
+        </w:rPr>
+        <w:t xml:space="preserve">בסרטון "שלא יהיה מאוחר מדי" סוכן החיברות הראשוני של תאמר, המשפחה, נפגע קשות בשל התמכרות האב לאלכוהול. הבית משדר חוסר יציבות, מתח ובושה, והמסר שתאמר סופג בו הוא שאין מבוגר פנוי שאפשר להישען עליו. בית הספר, סוכן פורמלי המייצג חוק וסדר, דורש ממנו התנהגות נורמטיבית אך אינו מזהה בזמן את המצוקה שמאחורי ההתנהגות. קבוצת השווים מעניקה לו שייכות זמנית, ולצדה לחץ חברתי ובחירות מסוכנות. משלושת המסרים האלה נבנה מי שתאמר היום: נער שערכו העצמי נפגע, הנקרע בין ציפייה לנורמטיביות ובין מציאות של הזנחה, ומחפש הכרה היכן שיקבל אותה.</w:t>
       </w:r>
     </w:p>
     <w:p>
@@ -757,7 +757,7 @@
           <w:szCs w:val="24"/>
           <w:rtl/>
         </w:rPr>
-        <w:t xml:space="preserve">כאשר שני סוכני חיברות משדרים לילד מסרים סותרים באותו נושא, נוצר אצלו דיסוננס: הוא נדרש להכריע בין נאמנויות, ולעיתים בין הרצון להשתייך לקבוצה ובין הערכים שספג בבית. ההכרעה תלויה בגיל, בעוצמת הקשר עם כל סוכן ובמחיר החברתי של כל בחירה, ובגיל ההתבגרות, כשכוחה של קבוצת השווים עולה, הצמתים האלה מתחדדים. כשהפער גדול מדי הילד עלול לחוות בלבול, אשמה או ניתוק מאחד הצדדים.</w:t>
+        <w:t xml:space="preserve">כאשר שני סוכני חיברות משדרים לילד מסרים סותרים באותו נושא, נוצר אצלו דיסוננס: הוא נדרש להכריע בין נאמנויות ולהחליט למי להאמין. ההכרעה תלויה בגיל, בעוצמת הקשר עם כל סוכן ובמחיר החברתי של כל בחירה, ובגיל ההתבגרות, כשכוחה של קבוצת השווים עולה, הצמתים האלה מתחדדים. אצל תאמר הסתירה חריפה במיוחד: בית הספר מצפה ממנו לתפקוד נורמטיבי, ואילו הבית מספק הזנחה ופגיעה בערך העצמי. פער כזה מקשה על גיבוש זהות יציבה ומוליד בלבול, אשמה וניתוק.</w:t>
       </w:r>
     </w:p>
     <w:p>
@@ -914,7 +914,7 @@
           <w:szCs w:val="24"/>
           <w:rtl/>
         </w:rPr>
-        <w:t xml:space="preserve">). בפועל המיקרוסיסטם של תאמר פועל נגדו: בבית הוא כמעט שקוף וההורים אינם פנויים אליו רגשית, ובבית הספר הוא מתויג כבעייתי ופוגש נזיפה והרחקה במקום שאלה מה עובר עליו. היחידים שנותנים לו מקום הם החברים ברחוב, ולכן השפעתם גוברת. ילד שלא רואים אותו מייצר התנהגות שאי אפשר להתעלם ממנה.</w:t>
+        <w:t xml:space="preserve">). בפועל המיקרוסיסטם של תאמר פועל נגדו. התמכרות האב לאלכוהול משבשת את תפקודו ההורי: הוא אינו מספק לבנו ביטחון, הגנה ותמיכה, והאווירה בבית רוויה מתח, חוסר יציבות ובושה. תאמר כועס על אביו, מתבייש מול חבריו וערכו העצמי נשחק. ילד שחווה הזנחה כזו מתקשה לבנות קשר חיובי עם דמויות סמכות, וכך תאמר מגיע לכיתה עם התנהגות מתריסה, והמורים פוגשים את ההתנהגות בלי לראות את הילד שמאחוריה.</w:t>
       </w:r>
     </w:p>
     <w:p>
@@ -947,23 +947,23 @@
           <w:szCs w:val="24"/>
           <w:rtl/>
         </w:rPr>
-        <w:t xml:space="preserve">). אצל תאמר המזוסיסטם כשל. בין הבית לבית הספר לא התקיים קשר של ממש: ההורים זומנו רק כשהתעורר משבר, בשיחות שעסקו בעונש ולא בילד, וכל גורם החזיק חתיכה מהתמונה בלי שאיש ראה אותה בשלמותה. לדעתנו נכון היה לזמן את ההורים מוקדם, מתוך שותפות ולא האשמה, לשתף את היועצת וגורם רווחה, ולבנות תוכנית משותפת עם מבוגר אחד שמלווה את תאמר ברציפות.</w:t>
-      </w:r>
-    </w:p>
-    <w:p>
-      <w:pPr>
-        <w:bidi/>
-        <w:spacing w:after="0" w:before="0" w:line="360" w:lineRule="auto"/>
-        <w:jc w:val="both"/>
-      </w:pPr>
-      <w:r>
-        <w:rPr>
-          <w:rFonts w:ascii="Times New Roman" w:cs="David" w:hAnsi="Times New Roman"/>
-          <w:sz w:val="24"/>
-          <w:szCs w:val="24"/>
-          <w:rtl/>
-        </w:rPr>
-        <w:t xml:space="preserve">באקסוסיסטם נמצאות מערכות שתאמר אינו משתתף בהן ישירות אך הן משפיעות על חייו: מחלקת הרווחה, מקומות העבודה של הוריו והרשות המקומית ותקציביה. במקרוסיסטם נמצאים הערכים והתנאים של החברה כולה: יישובים באשכולות חברתיים-כלכליים נמוכים, עלייה חדה באלימות ובפשיעה, ומתח מתמיד בין מסורת למודרניזציה שבתוכו נדרש המתבגר להכריע בין קונפורמיות לאינדיווידואליות (</w:t>
+        <w:t xml:space="preserve">). אצל תאמר המזוסיסטם כשל. בין הבית לבית הספר אין שיח רציף: הקשיים שהוא נושא מהבית מחלחלים להתנהגותו ולהישגיו, אך בית הספר קורא אותם כבעיית משמעת ולא כאיתות מצוקה, ואיש אינו מזהה את הסימנים בזמן. כל גורם מחזיק חתיכה מהתמונה בלי שאיש רואה אותה בשלמותה. לדעתנו נכון היה לקיים שיתוף פעולה שוטף בין המחנכת, היועצת וההורים, בשיח פתוח ולא שיפוטי, להפנות את המשפחה לגורמי טיפול ולבנות תוכנית משותפת עם מבוגר אחד שמלווה את תאמר ברציפות. זיהוי מוקדם כזה היה יכול לשנות את מסלולו.</w:t>
+      </w:r>
+    </w:p>
+    <w:p>
+      <w:pPr>
+        <w:bidi/>
+        <w:spacing w:after="0" w:before="0" w:line="360" w:lineRule="auto"/>
+        <w:jc w:val="both"/>
+      </w:pPr>
+      <w:r>
+        <w:rPr>
+          <w:rFonts w:ascii="Times New Roman" w:cs="David" w:hAnsi="Times New Roman"/>
+          <w:sz w:val="24"/>
+          <w:szCs w:val="24"/>
+          <w:rtl/>
+        </w:rPr>
+        <w:t xml:space="preserve">באקסוסיסטם נמצאות מערכות שתאמר אינו משתתף בהן ישירות אך הן מעצבות את חייו, וגם בהן ניכר כשל: מחלקת הרווחה לא זיהתה את המשפחה כמשפחה בסיכון ולא הפעילה תוכנית התערבות, התמכרות האב נותרה ללא מענה טיפולי, המשפחה המורחבת לא נרתמה לתמיכה, ומסגרות חינוך בלתי פורמלי, חוגים או תנועת נוער, כלל אינן חלק מחייו של תאמר, אף שהיו יכולות להעניק לו דמות מבוגר משמעותית וחוויית הצלחה. במקרוסיסטם פועלים הערכים והנורמות של החברה כולה: הסטיגמה סביב התמכרות, הנתפסת כחולשה אישית ולא כמחלה, דוחפת את המשפחה להסתיר את הבעיה במקום לבקש עזרה, וזאת על רקע מצוקה חברתית-כלכלית ומתח מתמיד בין מסורת למודרניזציה (</w:t>
       </w:r>
       <w:r>
         <w:rPr>
@@ -980,7 +980,7 @@
           <w:szCs w:val="24"/>
           <w:rtl/>
         </w:rPr>
-        <w:t xml:space="preserve">). התקרית הסופית בסרטון אינה רגע אחד אלא סוף של רצף: כישלונות ותיוג בבית הספר, הרחקה שהוציאה את תאמר מהמסגרת אל הרחוב, שוטטות והתחברות לנערים מבוגרים שהעניקו שייכות במחיר גבולות שנפרצו בזה אחר זה. בכל צומת עמד מבוגר שיכול היה לעצור: הורה שישאל, מורה שיתעניין במקום להעניש, עובד רווחה שיגיע הביתה. קריאת האירועים דרך המעגלים מראה שהכשל אינו של תאמר לבדו אלא של כל מעגל שוויתר עליו בתורו, עד שהרחוב נשאר היחיד שפעל.</w:t>
+        <w:t xml:space="preserve">). התקרית הסופית, השוד בבית הספר, אינה אירוע מבודד אלא סופו של תהליך מצטבר: פגיעה רגשית מתמשכת בבית, תיוג וענישה בבית הספר, והיעדר כל מסגרת חלופית של שייכות. מודל כבש"ה שנלמד בקורס מבהיר את התמונה: ארבעת הצרכים הבסיסיים של תאמר נותרו ללא מענה. כבודו נפגע בשל הבושה סביב מצב אביו, ביטחונו התערער באווירת הבית, שייכות לא מצא באף מסגרת, והצלחה לא חווה לא בלימודים ולא בחברה (סעיד, 2026). נער שכל ארבעת הצרכים האלה חסומים אצלו פועל בסוף מתוך ייאוש ותסכול, ובכל צומת ברצף עמד מבוגר שיכול היה לעצור זאת ולא עצר.</w:t>
       </w:r>
     </w:p>
     <w:p>
@@ -1476,6 +1476,43 @@
           <w:rtl/>
         </w:rPr>
         <w:t xml:space="preserve"> (עמ' 191-214). אח.</w:t>
+      </w:r>
+    </w:p>
+    <w:p>
+      <w:pPr>
+        <w:bidi/>
+        <w:spacing w:line="480" w:lineRule="auto"/>
+        <w:ind w:left="709" w:hanging="709"/>
+        <w:jc w:val="right"/>
+      </w:pPr>
+      <w:r>
+        <w:rPr>
+          <w:rFonts w:ascii="Times New Roman" w:cs="David" w:hAnsi="Times New Roman"/>
+          <w:sz w:val="24"/>
+          <w:szCs w:val="24"/>
+          <w:rtl/>
+        </w:rPr>
+        <w:t xml:space="preserve">סעיד, ח' (2026). </w:t>
+      </w:r>
+      <w:r>
+        <w:rPr>
+          <w:rFonts w:ascii="Times New Roman" w:cs="David" w:hAnsi="Times New Roman"/>
+          <w:i/>
+          <w:iCs/>
+          <w:sz w:val="24"/>
+          <w:szCs w:val="24"/>
+          <w:rtl/>
+        </w:rPr>
+        <w:t xml:space="preserve">סוכני חברות ומודל כבש"ה</w:t>
+      </w:r>
+      <w:r>
+        <w:rPr>
+          <w:rFonts w:ascii="Times New Roman" w:cs="David" w:hAnsi="Times New Roman"/>
+          <w:sz w:val="24"/>
+          <w:szCs w:val="24"/>
+          <w:rtl/>
+        </w:rPr>
+        <w:t xml:space="preserve"> [מצגת הרצאה]. הקורס ילד, משפחה וקהילה.</w:t>
       </w:r>
     </w:p>
     <w:p>

</xml_diff>

<commit_message>
Add submitter details and expand the reflections
Fill in the cover page with both submitters' names, ID numbers and the
Hebrew and Gregorian submission date. Rename the personal sections to
the submitters' names, adjust the personal passages to masculine
grammar, and expand both closing reflections while keeping the body
within five pages.

Co-Authored-By: Claude Fable 5 <noreply@anthropic.com>
Claude-Session: https://claude.ai/code/session_01RTfF1BRnBQMXWcgMPKSVNY
</commit_message>
<xml_diff>
--- a/עבודה מסכמת - ילד משפחה וקהילה.docx
+++ b/עבודה מסכמת - ילד משפחה וקהילה.docx
@@ -150,13 +150,13 @@
       <w:r>
         <w:rPr>
           <w:rFonts w:ascii="Times New Roman" w:cs="David" w:hAnsi="Times New Roman"/>
+          <w:b/>
+          <w:bCs/>
           <w:sz w:val="28"/>
           <w:szCs w:val="28"/>
-          <w:highlight w:val="yellow"/>
-          <w:highlightCs w:val="yellow"/>
-          <w:rtl/>
-        </w:rPr>
-        <w:t xml:space="preserve">מגישה 1: [שם מלא + ת"ז - להשלים]</w:t>
+          <w:rtl/>
+        </w:rPr>
+        <w:t xml:space="preserve">מגישים:</w:t>
       </w:r>
     </w:p>
     <w:p>
@@ -170,27 +170,9 @@
           <w:rFonts w:ascii="Times New Roman" w:cs="David" w:hAnsi="Times New Roman"/>
           <w:sz w:val="28"/>
           <w:szCs w:val="28"/>
-          <w:highlight w:val="yellow"/>
-          <w:highlightCs w:val="yellow"/>
-          <w:rtl/>
-        </w:rPr>
-        <w:t xml:space="preserve">מגישה 2: [שם מלא + ת"ז - להשלים]</w:t>
-      </w:r>
-    </w:p>
-    <w:p>
-      <w:pPr>
-        <w:bidi/>
-        <w:spacing w:after="0" w:before="0" w:line="360" w:lineRule="auto"/>
-        <w:jc w:val="both"/>
-      </w:pPr>
-      <w:r>
-        <w:rPr>
-          <w:rFonts w:ascii="Times New Roman" w:cs="David" w:hAnsi="Times New Roman"/>
-          <w:sz w:val="24"/>
-          <w:szCs w:val="24"/>
-          <w:rtl/>
-        </w:rPr>
-        <w:t xml:space="preserve"> </w:t>
+          <w:rtl/>
+        </w:rPr>
+        <w:t xml:space="preserve">רביע אלטורי, ת.ז. 209529783</w:t>
       </w:r>
     </w:p>
     <w:p>
@@ -206,7 +188,39 @@
           <w:szCs w:val="28"/>
           <w:rtl/>
         </w:rPr>
-        <w:t xml:space="preserve">מועד הגשה: 30.7.2026</w:t>
+        <w:t xml:space="preserve">רדואן אלטורי, ת.ז. 300632767</w:t>
+      </w:r>
+    </w:p>
+    <w:p>
+      <w:pPr>
+        <w:bidi/>
+        <w:spacing w:after="0" w:before="0" w:line="360" w:lineRule="auto"/>
+        <w:jc w:val="both"/>
+      </w:pPr>
+      <w:r>
+        <w:rPr>
+          <w:rFonts w:ascii="Times New Roman" w:cs="David" w:hAnsi="Times New Roman"/>
+          <w:sz w:val="24"/>
+          <w:szCs w:val="24"/>
+          <w:rtl/>
+        </w:rPr>
+        <w:t xml:space="preserve"> </w:t>
+      </w:r>
+    </w:p>
+    <w:p>
+      <w:pPr>
+        <w:bidi/>
+        <w:spacing w:after="0" w:before="0" w:line="360" w:lineRule="auto"/>
+        <w:jc w:val="center"/>
+      </w:pPr>
+      <w:r>
+        <w:rPr>
+          <w:rFonts w:ascii="Times New Roman" w:cs="David" w:hAnsi="Times New Roman"/>
+          <w:sz w:val="28"/>
+          <w:szCs w:val="28"/>
+          <w:rtl/>
+        </w:rPr>
+        <w:t xml:space="preserve">ט"ז באב תשפ"ו, 30 ביולי 2026</w:t>
       </w:r>
     </w:p>
     <w:p>
@@ -582,7 +596,7 @@
           <w:szCs w:val="24"/>
           <w:rtl/>
         </w:rPr>
-        <w:t xml:space="preserve">התייחסות אישית - מגישה 1: </w:t>
+        <w:t xml:space="preserve">התייחסות אישית - רביע: </w:t>
       </w:r>
       <w:r>
         <w:rPr>
@@ -609,16 +623,16 @@
           <w:szCs w:val="24"/>
           <w:rtl/>
         </w:rPr>
-        <w:t xml:space="preserve">התייחסות אישית - מגישה 2: </w:t>
-      </w:r>
-      <w:r>
-        <w:rPr>
-          <w:rFonts w:ascii="Times New Roman" w:cs="David" w:hAnsi="Times New Roman"/>
-          <w:sz w:val="24"/>
-          <w:szCs w:val="24"/>
-          <w:rtl/>
-        </w:rPr>
-        <w:t xml:space="preserve">אני גדלתי בעיר, בבניין שבו השכנים בקושי הכירו זה את זה, ולכן הקהילה שלי לא הייתה השכונה אלא המשפחה המורחבת. בכל יום שישי התאספנו כולנו בבית של סבא וסבתא, והדודות שלי היו בשבילי כמו אימהות נוספות: הן ידעו הכול, התערבו בהכול, ותמיד היה למי לפנות. כילדה זה נראה לי מובן מאליו. היום אני מבינה שהמפגש השבועי הזה היה המנגנון שדרכו עברו אליי הערכים, השפה והשייכות, ושילדות בלי מעגל כזה נראית אחרת לגמרי.</w:t>
+        <w:t xml:space="preserve">התייחסות אישית - רדואן: </w:t>
+      </w:r>
+      <w:r>
+        <w:rPr>
+          <w:rFonts w:ascii="Times New Roman" w:cs="David" w:hAnsi="Times New Roman"/>
+          <w:sz w:val="24"/>
+          <w:szCs w:val="24"/>
+          <w:rtl/>
+        </w:rPr>
+        <w:t xml:space="preserve">אני גדלתי בעיר, בבניין שבו השכנים בקושי הכירו זה את זה, ולכן הקהילה שלי לא הייתה השכונה אלא המשפחה המורחבת. בכל יום שישי התאספנו כולנו בבית של סבא וסבתא, והדודות שלי היו בשבילי כמו אימהות נוספות: הן ידעו הכול, התערבו בהכול, ותמיד היה למי לפנות. כילד זה נראה לי מובן מאליו. היום אני מבין שהמפגש השבועי הזה היה המנגנון שדרכו עברו אליי הערכים, השפה והשייכות, ושילדות בלי מעגל כזה נראית אחרת לגמרי.</w:t>
       </w:r>
     </w:p>
     <w:p>
@@ -705,43 +719,43 @@
           <w:szCs w:val="24"/>
           <w:rtl/>
         </w:rPr>
-        <w:t xml:space="preserve">סוכן החיברות המשמעותי שלי - מגישה 1: </w:t>
-      </w:r>
-      <w:r>
-        <w:rPr>
-          <w:rFonts w:ascii="Times New Roman" w:cs="David" w:hAnsi="Times New Roman"/>
-          <w:sz w:val="24"/>
-          <w:szCs w:val="24"/>
-          <w:rtl/>
-        </w:rPr>
-        <w:t xml:space="preserve">סוכנת החיברות המשמעותית שלי הייתה סבתי. גדלתי לידה, וממנה קיבלתי את המסרים שמלווים אותי עד היום: מכבדים כל אורח שנכנס הביתה, לא מדברים על אנשים מאחורי גבם, ומי שמתמידה משיגה. היא לא הרצתה לי אף פעם. היא פשוט חיה כך, ואני למדתי מהתבוננות.</w:t>
-      </w:r>
-    </w:p>
-    <w:p>
-      <w:pPr>
-        <w:bidi/>
-        <w:spacing w:after="0" w:before="0" w:line="360" w:lineRule="auto"/>
-        <w:jc w:val="both"/>
-      </w:pPr>
-      <w:r>
-        <w:rPr>
-          <w:rFonts w:ascii="Times New Roman" w:cs="David" w:hAnsi="Times New Roman"/>
-          <w:b/>
-          <w:bCs/>
-          <w:sz w:val="24"/>
-          <w:szCs w:val="24"/>
-          <w:rtl/>
-        </w:rPr>
-        <w:t xml:space="preserve">סוכן החיברות המשמעותי שלי - מגישה 2: </w:t>
-      </w:r>
-      <w:r>
-        <w:rPr>
-          <w:rFonts w:ascii="Times New Roman" w:cs="David" w:hAnsi="Times New Roman"/>
-          <w:sz w:val="24"/>
-          <w:szCs w:val="24"/>
-          <w:rtl/>
-        </w:rPr>
-        <w:t xml:space="preserve">אצלי הייתה זו המחנכת של כיתה ו'. היא הייתה הראשונה שאמרה לי בקול שאני טובה בלימודים, ונתנה לי אחריות על חניכת תלמידה צעירה. המסר שקיבלתי ממנה, שיש בי משהו לתת לאחרים, הוא הסיבה שבחרתי היום ללמוד חינוך.</w:t>
+        <w:t xml:space="preserve">סוכן החיברות המשמעותי שלי - רביע: </w:t>
+      </w:r>
+      <w:r>
+        <w:rPr>
+          <w:rFonts w:ascii="Times New Roman" w:cs="David" w:hAnsi="Times New Roman"/>
+          <w:sz w:val="24"/>
+          <w:szCs w:val="24"/>
+          <w:rtl/>
+        </w:rPr>
+        <w:t xml:space="preserve">סוכנת החיברות המשמעותית שלי הייתה סבתי. גדלתי לידה, וממנה קיבלתי את המסרים שמלווים אותי עד היום: מכבדים כל אורח שנכנס הביתה, לא מדברים על אנשים מאחורי גבם, ומי שמתמיד משיג. היא לא הרצתה לי אף פעם. היא פשוט חיה כך, ואני למדתי מהתבוננות.</w:t>
+      </w:r>
+    </w:p>
+    <w:p>
+      <w:pPr>
+        <w:bidi/>
+        <w:spacing w:after="0" w:before="0" w:line="360" w:lineRule="auto"/>
+        <w:jc w:val="both"/>
+      </w:pPr>
+      <w:r>
+        <w:rPr>
+          <w:rFonts w:ascii="Times New Roman" w:cs="David" w:hAnsi="Times New Roman"/>
+          <w:b/>
+          <w:bCs/>
+          <w:sz w:val="24"/>
+          <w:szCs w:val="24"/>
+          <w:rtl/>
+        </w:rPr>
+        <w:t xml:space="preserve">סוכן החיברות המשמעותי שלי - רדואן: </w:t>
+      </w:r>
+      <w:r>
+        <w:rPr>
+          <w:rFonts w:ascii="Times New Roman" w:cs="David" w:hAnsi="Times New Roman"/>
+          <w:sz w:val="24"/>
+          <w:szCs w:val="24"/>
+          <w:rtl/>
+        </w:rPr>
+        <w:t xml:space="preserve">אצלי הייתה זו המחנכת של כיתה ו'. היא הייתה הראשונה שאמרה לי בקול שאני טוב בלימודים, ונתנה לי אחריות על חניכת תלמיד צעיר. המסר שקיבלתי ממנה, שיש בי משהו לתת לאחרים, הוא הסיבה שבחרתי היום ללמוד חינוך.</w:t>
       </w:r>
     </w:p>
     <w:p>
@@ -775,43 +789,43 @@
           <w:szCs w:val="24"/>
           <w:rtl/>
         </w:rPr>
-        <w:t xml:space="preserve">צומת הכרעה אישי - מגישה 1: </w:t>
-      </w:r>
-      <w:r>
-        <w:rPr>
-          <w:rFonts w:ascii="Times New Roman" w:cs="David" w:hAnsi="Times New Roman"/>
-          <w:sz w:val="24"/>
-          <w:szCs w:val="24"/>
-          <w:rtl/>
-        </w:rPr>
-        <w:t xml:space="preserve">בסיום התיכון עמדתי בצומת בין שני סוכני חיברות. המחנכת שלי דחפה אותי להירשם לאוניברסיטה רחוקה מהבית, ואמרה שמגיע לי ללמוד במקום הטוב ביותר. בבית המסר היה הפוך: בת לא עוזבת את הבית לפני החתונה, והמשפחה קודמת לקריירה. בסוף בחרתי במכללה קרובה לבית. באותו רגע זו הרגישה כמו כניעה למסר של הבית, אבל היום אני רואה בזה הכרעה שלי: רציתי גם ללמוד וגם להישאר קרובה למשפחה, ומצאתי דרך שמכילה את שני המסרים במקום לבחור רק באחד.</w:t>
-      </w:r>
-    </w:p>
-    <w:p>
-      <w:pPr>
-        <w:bidi/>
-        <w:spacing w:after="0" w:before="0" w:line="360" w:lineRule="auto"/>
-        <w:jc w:val="both"/>
-      </w:pPr>
-      <w:r>
-        <w:rPr>
-          <w:rFonts w:ascii="Times New Roman" w:cs="David" w:hAnsi="Times New Roman"/>
-          <w:b/>
-          <w:bCs/>
-          <w:sz w:val="24"/>
-          <w:szCs w:val="24"/>
-          <w:rtl/>
-        </w:rPr>
-        <w:t xml:space="preserve">צומת הכרעה אישי - מגישה 2: </w:t>
-      </w:r>
-      <w:r>
-        <w:rPr>
-          <w:rFonts w:ascii="Times New Roman" w:cs="David" w:hAnsi="Times New Roman"/>
-          <w:sz w:val="24"/>
-          <w:szCs w:val="24"/>
-          <w:rtl/>
-        </w:rPr>
-        <w:t xml:space="preserve">בגיל שש עשרה החברות שלי פתחו חשבונות ברשתות החברתיות והעלו תמונות מכל בילוי. המסר שלהן היה ברור: מי שלא שם, לא קיימת. בבית המסר היה הפוך, שבת ממשפחה מכובדת לא מפרסמת את עצמה. התלבטתי חודשים. בסוף פתחתי חשבון, אבל קבעתי לעצמי גבולות: בלי תמונות אישיות ובלי חשיפה של המשפחה. בחרתי כך כי רציתי להישאר חלק מקבוצת השווים בלי לוותר על הערכים שגדלתי עליהם, והפשרה הזו החזיקה מעמד עד היום.</w:t>
+        <w:t xml:space="preserve">צומת הכרעה אישי - רביע: </w:t>
+      </w:r>
+      <w:r>
+        <w:rPr>
+          <w:rFonts w:ascii="Times New Roman" w:cs="David" w:hAnsi="Times New Roman"/>
+          <w:sz w:val="24"/>
+          <w:szCs w:val="24"/>
+          <w:rtl/>
+        </w:rPr>
+        <w:t xml:space="preserve">בסיום התיכון עמדתי בצומת בין שני סוכני חיברות. המחנך שלי דחף אותי להירשם לאוניברסיטה רחוקה מהבית, ואמר שמגיע לי ללמוד במקום הטוב ביותר. בבית המסר היה הפוך: הבן נשאר קרוב, עוזר בפרנסה ולא מתרחק מהמשפחה. בסוף בחרתי במכללה קרובה לבית. באותו רגע זה הרגיש כמו ויתור, אבל היום אני רואה בזה הכרעה שלי: רציתי גם ללמוד וגם להישאר קרוב למשפחה, ומצאתי דרך שמכילה את שני המסרים במקום לבחור רק באחד.</w:t>
+      </w:r>
+    </w:p>
+    <w:p>
+      <w:pPr>
+        <w:bidi/>
+        <w:spacing w:after="0" w:before="0" w:line="360" w:lineRule="auto"/>
+        <w:jc w:val="both"/>
+      </w:pPr>
+      <w:r>
+        <w:rPr>
+          <w:rFonts w:ascii="Times New Roman" w:cs="David" w:hAnsi="Times New Roman"/>
+          <w:b/>
+          <w:bCs/>
+          <w:sz w:val="24"/>
+          <w:szCs w:val="24"/>
+          <w:rtl/>
+        </w:rPr>
+        <w:t xml:space="preserve">צומת הכרעה אישי - רדואן: </w:t>
+      </w:r>
+      <w:r>
+        <w:rPr>
+          <w:rFonts w:ascii="Times New Roman" w:cs="David" w:hAnsi="Times New Roman"/>
+          <w:sz w:val="24"/>
+          <w:szCs w:val="24"/>
+          <w:rtl/>
+        </w:rPr>
+        <w:t xml:space="preserve">בגיל שש עשרה החברים שלי פתחו חשבונות ברשתות החברתיות והעלו סרטונים מכל בילוי. המסר שלהם היה ברור: מי שלא שם, לא קיים. בבית המסר היה הפוך, שאת חיי המשפחה לא מפרסמים ברשת ומי שמכבד את עצמו שומר על פרטיותו. התלבטתי חודשים. בסוף פתחתי חשבון, אבל קבעתי לעצמי גבולות: בלי חשיפה של המשפחה ובלי תיעוד של כל רגע. בחרתי כך כי רציתי להישאר חלק מקבוצת השווים בלי לוותר על הערכים שגדלתי עליהם, והפשרה הזו מחזיקה מעמד עד היום.</w:t>
       </w:r>
     </w:p>
     <w:p>
@@ -1148,43 +1162,43 @@
           <w:szCs w:val="24"/>
           <w:rtl/>
         </w:rPr>
-        <w:t xml:space="preserve">התבוננות אישית על פי המודל - מגישה 1: </w:t>
-      </w:r>
-      <w:r>
-        <w:rPr>
-          <w:rFonts w:ascii="Times New Roman" w:cs="David" w:hAnsi="Times New Roman"/>
-          <w:sz w:val="24"/>
-          <w:szCs w:val="24"/>
-          <w:rtl/>
-        </w:rPr>
-        <w:t xml:space="preserve">מצב הלחץ שחשבתי עליו הוא תקופת המבחנים של השנה הראשונה בתואר. האוטומט שלי היה ערוץ הרגש: בכיתי, שיתפתי את כולם בלחץ ולא הצלחתי לשבת ללמוד. מה שהקל עליי בסוף היה שילוב של ערוץ החברה, למידה משותפת עם חברה מהקורס שנתנה לי תחושה שאני לא לבד, ושל ערוץ השכל, בניית לוח זמנים שהחזיר לי שליטה. הערוץ שהייתי רוצה לפתח הוא ערוץ הגוף: אני יודעת שהליכה או ספורט היו משחררים חלק מהמתח, וזה הערוץ שאני הכי מזניחה.</w:t>
-      </w:r>
-    </w:p>
-    <w:p>
-      <w:pPr>
-        <w:bidi/>
-        <w:spacing w:after="0" w:before="0" w:line="360" w:lineRule="auto"/>
-        <w:jc w:val="both"/>
-      </w:pPr>
-      <w:r>
-        <w:rPr>
-          <w:rFonts w:ascii="Times New Roman" w:cs="David" w:hAnsi="Times New Roman"/>
-          <w:b/>
-          <w:bCs/>
-          <w:sz w:val="24"/>
-          <w:szCs w:val="24"/>
-          <w:rtl/>
-        </w:rPr>
-        <w:t xml:space="preserve">התבוננות אישית על פי המודל - מגישה 2: </w:t>
-      </w:r>
-      <w:r>
-        <w:rPr>
-          <w:rFonts w:ascii="Times New Roman" w:cs="David" w:hAnsi="Times New Roman"/>
-          <w:sz w:val="24"/>
-          <w:szCs w:val="24"/>
-          <w:rtl/>
-        </w:rPr>
-        <w:t xml:space="preserve">אצלי מצב הלחץ היה תקופת האשפוז של אבי. האוטומט שלי היה ערוץ השכל: התחלתי לארגן, לתאם תורים, לאסוף מידע על המחלה. זה החזיק אותי מתפקדת, אבל דחק הצידה את הרגש, ורק אחרי שבועות הרשיתי לעצמי לבכות. מה שהקל עליי היה ערוץ האמונה, תפילה שנתנה לי תחושה שיש על מי להישען, וערוץ המשפחה והחברה, חלוקת הנטל עם אחיי. הייתי רוצה לפתח את ערוץ הרגש, לתת לתחושות מקום בזמן אמת במקום לדחות אותן עד שהן מציפות אותי.</w:t>
+        <w:t xml:space="preserve">התבוננות אישית על פי המודל - רביע: </w:t>
+      </w:r>
+      <w:r>
+        <w:rPr>
+          <w:rFonts w:ascii="Times New Roman" w:cs="David" w:hAnsi="Times New Roman"/>
+          <w:sz w:val="24"/>
+          <w:szCs w:val="24"/>
+          <w:rtl/>
+        </w:rPr>
+        <w:t xml:space="preserve">מצב הלחץ שחשבתי עליו הוא תקופת המבחנים של השנה הראשונה בתואר. האוטומט שלי היה ערוץ הרגש: בכיתי, שיתפתי את כולם בלחץ ולא הצלחתי לשבת ללמוד. מה שהקל עליי בסוף היה שילוב של ערוץ החברה, למידה משותפת עם חבר מהקורס שנתן לי תחושה שאני לא לבד, ושל ערוץ השכל, בניית לוח זמנים שהחזיר לי שליטה. הערוץ שהייתי רוצה לפתח הוא ערוץ הגוף: אני יודע שהליכה או ספורט היו משחררים חלק מהמתח, וזה הערוץ שאני הכי מזניח.</w:t>
+      </w:r>
+    </w:p>
+    <w:p>
+      <w:pPr>
+        <w:bidi/>
+        <w:spacing w:after="0" w:before="0" w:line="360" w:lineRule="auto"/>
+        <w:jc w:val="both"/>
+      </w:pPr>
+      <w:r>
+        <w:rPr>
+          <w:rFonts w:ascii="Times New Roman" w:cs="David" w:hAnsi="Times New Roman"/>
+          <w:b/>
+          <w:bCs/>
+          <w:sz w:val="24"/>
+          <w:szCs w:val="24"/>
+          <w:rtl/>
+        </w:rPr>
+        <w:t xml:space="preserve">התבוננות אישית על פי המודל - רדואן: </w:t>
+      </w:r>
+      <w:r>
+        <w:rPr>
+          <w:rFonts w:ascii="Times New Roman" w:cs="David" w:hAnsi="Times New Roman"/>
+          <w:sz w:val="24"/>
+          <w:szCs w:val="24"/>
+          <w:rtl/>
+        </w:rPr>
+        <w:t xml:space="preserve">אצלי מצב הלחץ היה תקופת האשפוז של אבי. האוטומט שלי היה ערוץ השכל: התחלתי לארגן, לתאם תורים, לאסוף מידע על המחלה. זה החזיק אותי מתפקד, אבל דחק הצידה את הרגש, ורק אחרי שבועות הרשיתי לעצמי לבכות. מה שהקל עליי היה ערוץ האמונה, תפילה שנתנה לי תחושה שיש על מי להישען, וערוץ המשפחה והחברה, חלוקת הנטל עם אחיי. הייתי רוצה לפתח את ערוץ הרגש, לתת לתחושות מקום בזמן אמת במקום לדחות אותן עד שהן מציפות אותי.</w:t>
       </w:r>
     </w:p>
     <w:p>
@@ -1222,54 +1236,50 @@
           <w:szCs w:val="24"/>
           <w:rtl/>
         </w:rPr>
-        <w:t xml:space="preserve">מגישה 1: </w:t>
-      </w:r>
-      <w:r>
-        <w:rPr>
-          <w:rFonts w:ascii="Times New Roman" w:cs="David" w:hAnsi="Times New Roman"/>
-          <w:sz w:val="24"/>
-          <w:szCs w:val="24"/>
-          <w:rtl/>
-        </w:rPr>
-        <w:t xml:space="preserve">נכנסתי לקורס בטוחה שמשפחה היא עניין פרטי: מה שקורה בבית נשאר בבית, וילד מעוצב קודם כל על ידי הוריו. המודל האקולוגי ערער לי את התפיסה הזו. ההבנה שילד חי בתוך מעגלים שמשפיעים עליו גם כשהוא לא פוגש אותם ישירות, כמו החלטות של רשות מקומית או נורמות של חברה שלמה, שינתה את האופן שבו אני מסתכלת על ילדים ועל התנהגות שלהם. הדבר הפחות מחמיא שגיליתי על עצמי הוא שגם אני ממהרת לתייג: כשצפיתי בתאמר בתחילת הסרטון, המחשבה הראשונה שלי הייתה "ילד אלים", בדיוק המבט שהעבודה הזו מבקרת. למדתי גם משהו על המשפחה שלי: פתאום זיהיתי אצל אמי דפוסים שהיא קיבלה מאמה, והבנתי עד כמה ההעברה הבין-דורית נוכחת גם אצלנו. אני לוקחת מהקורס כלל עבודה אחד: לפני שאני שופטת ילד, לשאול איזה מעגל סביבו נשבר.</w:t>
-      </w:r>
-    </w:p>
-    <w:p>
-      <w:pPr>
-        <w:bidi/>
-        <w:spacing w:after="0" w:before="0" w:line="360" w:lineRule="auto"/>
-        <w:jc w:val="both"/>
-      </w:pPr>
-      <w:r>
-        <w:rPr>
-          <w:rFonts w:ascii="Times New Roman" w:cs="David" w:hAnsi="Times New Roman"/>
-          <w:b/>
-          <w:bCs/>
-          <w:sz w:val="24"/>
-          <w:szCs w:val="24"/>
-          <w:rtl/>
-        </w:rPr>
-        <w:t xml:space="preserve">מגישה 2: </w:t>
-      </w:r>
-      <w:r>
-        <w:rPr>
-          <w:rFonts w:ascii="Times New Roman" w:cs="David" w:hAnsi="Times New Roman"/>
-          <w:sz w:val="24"/>
-          <w:szCs w:val="24"/>
-          <w:rtl/>
-        </w:rPr>
-        <w:t xml:space="preserve">בשבילי הרגע המשמעותי בקורס היה המפגש עם המושג "רוחות רפאים מחדר הילדים". תמיד אמרתי לעצמי שאני אחנך את ילדיי אחרת לגמרי מאיך שחונכתי, ופתאום הבנתי שגם התגובות שלי היום, הקפדנות, הקושי לקבל ביקורת, הן אורחות מהעבר של הוריי ולא רק בחירות חופשיות שלי. זו הייתה תובנה לא נעימה, ודווקא בגללה חשובה. עוד למדתי שילדות היא לא דבר מובן מאליו אלא הבניה שתלויה בזמן, במקום ובקהילה, ושילדותי שלי, על החופש והביטחון שהיו בה, היא זכות שלא לכל ילד יש. כשאעבוד עם ילדים אני רוצה לזכור את שני הדברים האלה יחד: שהילד שמולי נושא איתו את המעגלים שבתוכם גדל, ושאני מביאה למפגש את המעגלים שלי. המודעות הזו לא פותרת הכול, אבל היא נקודת התחלה כנה.</w:t>
-      </w:r>
-    </w:p>
-    <w:p>
-      <w:r>
-        <w:br w:type="page"/>
-      </w:r>
-    </w:p>
-    <w:p>
-      <w:pPr>
-        <w:bidi/>
-        <w:spacing w:after="240" w:before="0" w:line="360" w:lineRule="auto"/>
+        <w:t xml:space="preserve">רביע: </w:t>
+      </w:r>
+      <w:r>
+        <w:rPr>
+          <w:rFonts w:ascii="Times New Roman" w:cs="David" w:hAnsi="Times New Roman"/>
+          <w:sz w:val="24"/>
+          <w:szCs w:val="24"/>
+          <w:rtl/>
+        </w:rPr>
+        <w:t xml:space="preserve">נכנסתי לקורס בטוח שמשפחה היא עניין פרטי: מה שקורה בבית נשאר בבית, וילד מעוצב קודם כל על ידי הוריו. המודל האקולוגי ערער לי את התפיסה הזו. ההבנה שילד חי בתוך מעגלים שמשפיעים עליו גם כשהוא אינו פוגש אותם ישירות, כמו החלטות של רשות מקומית או נורמות של חברה שלמה, שינתה את האופן שבו אני מסתכל על ילדים ועל ההתנהגות שלהם. את הדבר הפחות מחמיא גיליתי על עצמי מול תאמר: גם אני ממהר לתייג, שכן המחשבה הראשונה שלי בתחילת הסרטון הייתה "ילד אלים", בדיוק המבט שהעבודה הזו מבקרת. למדתי גם משהו על המשפחה שלי: פתאום זיהיתי אצל אמי דפוסים שהיא קיבלה מאמה, והבנתי עד כמה ההעברה הבין-דורית נוכחת גם אצלנו, לטוב ולרע. השיעורים על המשפחה הערבית נגעו בי באופן אישי, כי ראיתי בהם את הקהילה שבה גדלתי: הכוח של המשפחה המורחבת לצד המתח שבין שימור לשינוי. אני מסיים את הקורס עם כלל עבודה אחד שאקח לכל מסגרת חינוכית: לפני שאני שופט ילד, לשאול איזה מעגל סביבו נשבר ומה אני יכול לעשות כדי לחבר אותו מחדש.</w:t>
+      </w:r>
+    </w:p>
+    <w:p>
+      <w:pPr>
+        <w:bidi/>
+        <w:spacing w:after="0" w:before="0" w:line="360" w:lineRule="auto"/>
+        <w:jc w:val="both"/>
+      </w:pPr>
+      <w:r>
+        <w:rPr>
+          <w:rFonts w:ascii="Times New Roman" w:cs="David" w:hAnsi="Times New Roman"/>
+          <w:b/>
+          <w:bCs/>
+          <w:sz w:val="24"/>
+          <w:szCs w:val="24"/>
+          <w:rtl/>
+        </w:rPr>
+        <w:t xml:space="preserve">רדואן: </w:t>
+      </w:r>
+      <w:r>
+        <w:rPr>
+          <w:rFonts w:ascii="Times New Roman" w:cs="David" w:hAnsi="Times New Roman"/>
+          <w:sz w:val="24"/>
+          <w:szCs w:val="24"/>
+          <w:rtl/>
+        </w:rPr>
+        <w:t xml:space="preserve">בשבילי הרגע המשמעותי בקורס היה המפגש עם המושג "רוחות רפאים מחדר הילדים". תמיד אמרתי לעצמי שאחנך את ילדיי אחרת לגמרי מאיך שחונכתי, ופתאום הבנתי שגם התגובות שלי היום, הקפדנות והקושי לקבל ביקורת, הן אורחות מהעבר של הוריי ולא רק בחירות חופשיות שלי. זו הייתה תובנה לא נעימה, ודווקא בגללה חשובה. עוד למדתי שילדות אינה דבר מובן מאליו אלא הבניה התלויה בזמן, במקום ובקהילה, ושהילדות שלי, על החופש והביטחון שהיו בה, היא זכות שלא לכל ילד יש. גם העבודה בזוג לימדה אותי משהו: כשניתחנו יחד את הסרטון גיליתי שאנחנו רואים את אותן סצנות אחרת, ושהמעגלים שכל אחד מאיתנו גדל בתוכם צובעים גם את המבט המקצועי שלו. כשאעבוד עם ילדים אני רוצה לזכור את שני הדברים יחד: שהילד שמולי נושא איתו את המעגלים שבתוכם גדל, ושאני מביא למפגש את המעגלים שלי. המודעות הזו אינה פותרת הכול, אבל היא נקודת התחלה כנה.</w:t>
+      </w:r>
+    </w:p>
+    <w:p>
+      <w:pPr>
+        <w:pageBreakBefore/>
+        <w:bidi/>
+        <w:spacing w:after="240" w:line="360" w:lineRule="auto"/>
         <w:jc w:val="center"/>
       </w:pPr>
       <w:r>

</xml_diff>

<commit_message>
Add Ono Academic College logo to the cover page
Place the college logo centered at the top of the cover with the
institution name beneath it.

Co-Authored-By: Claude Fable 5 <noreply@anthropic.com>
Claude-Session: https://claude.ai/code/session_01RTfF1BRnBQMXWcgMPKSVNY
</commit_message>
<xml_diff>
--- a/עבודה מסכמת - ילד משפחה וקהילה.docx
+++ b/עבודה מסכמת - ילד משפחה וקהילה.docx
@@ -4,8 +4,67 @@
   <w:body>
     <w:p>
       <w:pPr>
-        <w:spacing w:before="1200"/>
-      </w:pPr>
+        <w:spacing w:after="300" w:before="400"/>
+        <w:jc w:val="center"/>
+      </w:pPr>
+      <w:r>
+        <w:drawing>
+          <wp:inline distT="0" distB="0" distL="0" distR="0">
+            <wp:extent cx="2076450" cy="1019175"/>
+            <wp:effectExtent t="0" r="0" b="0" l="0"/>
+            <wp:docPr id="1" name="" descr="" title=""/>
+            <wp:cNvGraphicFramePr>
+              <a:graphicFrameLocks xmlns:a="http://schemas.openxmlformats.org/drawingml/2006/main" noChangeAspect="1"/>
+            </wp:cNvGraphicFramePr>
+            <a:graphic xmlns:a="http://schemas.openxmlformats.org/drawingml/2006/main">
+              <a:graphicData uri="http://schemas.openxmlformats.org/drawingml/2006/picture">
+                <pic:pic xmlns:pic="http://schemas.openxmlformats.org/drawingml/2006/picture">
+                  <pic:nvPicPr>
+                    <pic:cNvPr id="0" name="" descr=""/>
+                    <pic:cNvPicPr>
+                      <a:picLocks noChangeAspect="1" noChangeArrowheads="1"/>
+                    </pic:cNvPicPr>
+                  </pic:nvPicPr>
+                  <pic:blipFill>
+                    <a:blip r:embed="rId7" cstate="none"/>
+                    <a:srcRect/>
+                    <a:stretch>
+                      <a:fillRect/>
+                    </a:stretch>
+                  </pic:blipFill>
+                  <pic:spPr bwMode="auto">
+                    <a:xfrm>
+                      <a:off x="0" y="0"/>
+                      <a:ext cx="2076450" cy="1019175"/>
+                    </a:xfrm>
+                    <a:prstGeom prst="rect">
+                      <a:avLst/>
+                    </a:prstGeom>
+                  </pic:spPr>
+                </pic:pic>
+              </a:graphicData>
+            </a:graphic>
+          </wp:inline>
+        </w:drawing>
+      </w:r>
+    </w:p>
+    <w:p>
+      <w:pPr>
+        <w:bidi/>
+        <w:spacing w:after="0" w:before="0" w:line="360" w:lineRule="auto"/>
+        <w:jc w:val="center"/>
+      </w:pPr>
+      <w:r>
+        <w:rPr>
+          <w:rFonts w:ascii="Times New Roman" w:cs="David" w:hAnsi="Times New Roman"/>
+          <w:b/>
+          <w:bCs/>
+          <w:sz w:val="32"/>
+          <w:szCs w:val="32"/>
+          <w:rtl/>
+        </w:rPr>
+        <w:t xml:space="preserve">הקריה האקדמית אונו</w:t>
+      </w:r>
     </w:p>
     <w:p>
       <w:pPr>

</xml_diff>